<commit_message>
Sync history draft with revised timeline
</commit_message>
<xml_diff>
--- a/01_History/EKITI30_History_Storytelling_Draft_v2.docx
+++ b/01_History/EKITI30_History_Storytelling_Draft_v2.docx
@@ -106,7 +106,7 @@
           <w:sz w:val="20"/>
           <w:szCs w:val="20"/>
         </w:rPr>
-        <w:t xml:space="preserve">Claims are tagged by evidence status; see the key on page 2.</w:t>
+        <w:t xml:space="preserve">Claims are tagged by evidence status; see the evidence key at the start of the text.</w:t>
       </w:r>
     </w:p>
     <w:p>
@@ -498,10 +498,10 @@
         </w:tblBorders>
       </w:tblPr>
       <w:tblGrid>
+        <w:gridCol w:w="2200"/>
         <w:gridCol w:w="2300"/>
-        <w:gridCol w:w="2350"/>
-        <w:gridCol w:w="1200"/>
-        <w:gridCol w:w="3176"/>
+        <w:gridCol w:w="1500"/>
+        <w:gridCol w:w="3026"/>
       </w:tblGrid>
       <w:tr>
         <w:trPr>
@@ -509,7 +509,7 @@
         </w:trPr>
         <w:tc>
           <w:tcPr>
-            <w:tcW w:type="dxa" w:w="2300"/>
+            <w:tcW w:type="dxa" w:w="2200"/>
             <w:tcBorders>
               <w:top w:val="single" w:color="C8D0C8" w:sz="4"/>
               <w:left w:val="single" w:color="C8D0C8" w:sz="4"/>
@@ -542,7 +542,7 @@
         </w:tc>
         <w:tc>
           <w:tcPr>
-            <w:tcW w:type="dxa" w:w="2350"/>
+            <w:tcW w:type="dxa" w:w="2300"/>
             <w:tcBorders>
               <w:top w:val="single" w:color="C8D0C8" w:sz="4"/>
               <w:left w:val="single" w:color="C8D0C8" w:sz="4"/>
@@ -575,7 +575,7 @@
         </w:tc>
         <w:tc>
           <w:tcPr>
-            <w:tcW w:type="dxa" w:w="1200"/>
+            <w:tcW w:type="dxa" w:w="1500"/>
             <w:tcBorders>
               <w:top w:val="single" w:color="C8D0C8" w:sz="4"/>
               <w:left w:val="single" w:color="C8D0C8" w:sz="4"/>
@@ -608,7 +608,7 @@
         </w:tc>
         <w:tc>
           <w:tcPr>
-            <w:tcW w:type="dxa" w:w="3176"/>
+            <w:tcW w:type="dxa" w:w="3026"/>
             <w:tcBorders>
               <w:top w:val="single" w:color="C8D0C8" w:sz="4"/>
               <w:left w:val="single" w:color="C8D0C8" w:sz="4"/>
@@ -646,7 +646,7 @@
         </w:trPr>
         <w:tc>
           <w:tcPr>
-            <w:tcW w:type="dxa" w:w="2300"/>
+            <w:tcW w:type="dxa" w:w="2200"/>
             <w:tcBorders>
               <w:top w:val="single" w:color="C8D0C8" w:sz="4"/>
               <w:left w:val="single" w:color="C8D0C8" w:sz="4"/>
@@ -678,7 +678,7 @@
         </w:tc>
         <w:tc>
           <w:tcPr>
-            <w:tcW w:type="dxa" w:w="2350"/>
+            <w:tcW w:type="dxa" w:w="2300"/>
             <w:tcBorders>
               <w:top w:val="single" w:color="C8D0C8" w:sz="4"/>
               <w:left w:val="single" w:color="C8D0C8" w:sz="4"/>
@@ -710,7 +710,7 @@
         </w:tc>
         <w:tc>
           <w:tcPr>
-            <w:tcW w:type="dxa" w:w="1200"/>
+            <w:tcW w:type="dxa" w:w="1500"/>
             <w:tcBorders>
               <w:top w:val="single" w:color="C8D0C8" w:sz="4"/>
               <w:left w:val="single" w:color="C8D0C8" w:sz="4"/>
@@ -742,7 +742,7 @@
         </w:tc>
         <w:tc>
           <w:tcPr>
-            <w:tcW w:type="dxa" w:w="3176"/>
+            <w:tcW w:type="dxa" w:w="3026"/>
             <w:tcBorders>
               <w:top w:val="single" w:color="C8D0C8" w:sz="4"/>
               <w:left w:val="single" w:color="C8D0C8" w:sz="4"/>
@@ -790,7 +790,7 @@
         </w:trPr>
         <w:tc>
           <w:tcPr>
-            <w:tcW w:type="dxa" w:w="2300"/>
+            <w:tcW w:type="dxa" w:w="2200"/>
             <w:tcBorders>
               <w:top w:val="single" w:color="C8D0C8" w:sz="4"/>
               <w:left w:val="single" w:color="C8D0C8" w:sz="4"/>
@@ -822,7 +822,7 @@
         </w:tc>
         <w:tc>
           <w:tcPr>
-            <w:tcW w:type="dxa" w:w="2350"/>
+            <w:tcW w:type="dxa" w:w="2300"/>
             <w:tcBorders>
               <w:top w:val="single" w:color="C8D0C8" w:sz="4"/>
               <w:left w:val="single" w:color="C8D0C8" w:sz="4"/>
@@ -854,7 +854,7 @@
         </w:tc>
         <w:tc>
           <w:tcPr>
-            <w:tcW w:type="dxa" w:w="1200"/>
+            <w:tcW w:type="dxa" w:w="1500"/>
             <w:tcBorders>
               <w:top w:val="single" w:color="C8D0C8" w:sz="4"/>
               <w:left w:val="single" w:color="C8D0C8" w:sz="4"/>
@@ -886,7 +886,7 @@
         </w:tc>
         <w:tc>
           <w:tcPr>
-            <w:tcW w:type="dxa" w:w="3176"/>
+            <w:tcW w:type="dxa" w:w="3026"/>
             <w:tcBorders>
               <w:top w:val="single" w:color="C8D0C8" w:sz="4"/>
               <w:left w:val="single" w:color="C8D0C8" w:sz="4"/>
@@ -934,7 +934,7 @@
         </w:trPr>
         <w:tc>
           <w:tcPr>
-            <w:tcW w:type="dxa" w:w="2300"/>
+            <w:tcW w:type="dxa" w:w="2200"/>
             <w:tcBorders>
               <w:top w:val="single" w:color="C8D0C8" w:sz="4"/>
               <w:left w:val="single" w:color="C8D0C8" w:sz="4"/>
@@ -966,7 +966,7 @@
         </w:tc>
         <w:tc>
           <w:tcPr>
-            <w:tcW w:type="dxa" w:w="2350"/>
+            <w:tcW w:type="dxa" w:w="2300"/>
             <w:tcBorders>
               <w:top w:val="single" w:color="C8D0C8" w:sz="4"/>
               <w:left w:val="single" w:color="C8D0C8" w:sz="4"/>
@@ -998,7 +998,7 @@
         </w:tc>
         <w:tc>
           <w:tcPr>
-            <w:tcW w:type="dxa" w:w="1200"/>
+            <w:tcW w:type="dxa" w:w="1500"/>
             <w:tcBorders>
               <w:top w:val="single" w:color="C8D0C8" w:sz="4"/>
               <w:left w:val="single" w:color="C8D0C8" w:sz="4"/>
@@ -1030,7 +1030,7 @@
         </w:tc>
         <w:tc>
           <w:tcPr>
-            <w:tcW w:type="dxa" w:w="3176"/>
+            <w:tcW w:type="dxa" w:w="3026"/>
             <w:tcBorders>
               <w:top w:val="single" w:color="C8D0C8" w:sz="4"/>
               <w:left w:val="single" w:color="C8D0C8" w:sz="4"/>
@@ -1078,7 +1078,7 @@
         </w:trPr>
         <w:tc>
           <w:tcPr>
-            <w:tcW w:type="dxa" w:w="2300"/>
+            <w:tcW w:type="dxa" w:w="2200"/>
             <w:tcBorders>
               <w:top w:val="single" w:color="C8D0C8" w:sz="4"/>
               <w:left w:val="single" w:color="C8D0C8" w:sz="4"/>
@@ -1110,7 +1110,7 @@
         </w:tc>
         <w:tc>
           <w:tcPr>
-            <w:tcW w:type="dxa" w:w="2350"/>
+            <w:tcW w:type="dxa" w:w="2300"/>
             <w:tcBorders>
               <w:top w:val="single" w:color="C8D0C8" w:sz="4"/>
               <w:left w:val="single" w:color="C8D0C8" w:sz="4"/>
@@ -1142,7 +1142,7 @@
         </w:tc>
         <w:tc>
           <w:tcPr>
-            <w:tcW w:type="dxa" w:w="1200"/>
+            <w:tcW w:type="dxa" w:w="1500"/>
             <w:tcBorders>
               <w:top w:val="single" w:color="C8D0C8" w:sz="4"/>
               <w:left w:val="single" w:color="C8D0C8" w:sz="4"/>
@@ -1174,7 +1174,7 @@
         </w:tc>
         <w:tc>
           <w:tcPr>
-            <w:tcW w:type="dxa" w:w="3176"/>
+            <w:tcW w:type="dxa" w:w="3026"/>
             <w:tcBorders>
               <w:top w:val="single" w:color="C8D0C8" w:sz="4"/>
               <w:left w:val="single" w:color="C8D0C8" w:sz="4"/>
@@ -1243,7 +1243,7 @@
         </w:trPr>
         <w:tc>
           <w:tcPr>
-            <w:tcW w:type="dxa" w:w="2300"/>
+            <w:tcW w:type="dxa" w:w="2200"/>
             <w:tcBorders>
               <w:top w:val="single" w:color="C8D0C8" w:sz="4"/>
               <w:left w:val="single" w:color="C8D0C8" w:sz="4"/>
@@ -1275,7 +1275,7 @@
         </w:tc>
         <w:tc>
           <w:tcPr>
-            <w:tcW w:type="dxa" w:w="2350"/>
+            <w:tcW w:type="dxa" w:w="2300"/>
             <w:tcBorders>
               <w:top w:val="single" w:color="C8D0C8" w:sz="4"/>
               <w:left w:val="single" w:color="C8D0C8" w:sz="4"/>
@@ -1307,7 +1307,7 @@
         </w:tc>
         <w:tc>
           <w:tcPr>
-            <w:tcW w:type="dxa" w:w="1200"/>
+            <w:tcW w:type="dxa" w:w="1500"/>
             <w:tcBorders>
               <w:top w:val="single" w:color="C8D0C8" w:sz="4"/>
               <w:left w:val="single" w:color="C8D0C8" w:sz="4"/>
@@ -1339,7 +1339,7 @@
         </w:tc>
         <w:tc>
           <w:tcPr>
-            <w:tcW w:type="dxa" w:w="3176"/>
+            <w:tcW w:type="dxa" w:w="3026"/>
             <w:tcBorders>
               <w:top w:val="single" w:color="C8D0C8" w:sz="4"/>
               <w:left w:val="single" w:color="C8D0C8" w:sz="4"/>
@@ -1387,7 +1387,7 @@
         </w:trPr>
         <w:tc>
           <w:tcPr>
-            <w:tcW w:type="dxa" w:w="2300"/>
+            <w:tcW w:type="dxa" w:w="2200"/>
             <w:tcBorders>
               <w:top w:val="single" w:color="C8D0C8" w:sz="4"/>
               <w:left w:val="single" w:color="C8D0C8" w:sz="4"/>
@@ -1419,7 +1419,7 @@
         </w:tc>
         <w:tc>
           <w:tcPr>
-            <w:tcW w:type="dxa" w:w="2350"/>
+            <w:tcW w:type="dxa" w:w="2300"/>
             <w:tcBorders>
               <w:top w:val="single" w:color="C8D0C8" w:sz="4"/>
               <w:left w:val="single" w:color="C8D0C8" w:sz="4"/>
@@ -1451,7 +1451,7 @@
         </w:tc>
         <w:tc>
           <w:tcPr>
-            <w:tcW w:type="dxa" w:w="1200"/>
+            <w:tcW w:type="dxa" w:w="1500"/>
             <w:tcBorders>
               <w:top w:val="single" w:color="C8D0C8" w:sz="4"/>
               <w:left w:val="single" w:color="C8D0C8" w:sz="4"/>
@@ -1483,7 +1483,7 @@
         </w:tc>
         <w:tc>
           <w:tcPr>
-            <w:tcW w:type="dxa" w:w="3176"/>
+            <w:tcW w:type="dxa" w:w="3026"/>
             <w:tcBorders>
               <w:top w:val="single" w:color="C8D0C8" w:sz="4"/>
               <w:left w:val="single" w:color="C8D0C8" w:sz="4"/>
@@ -1531,7 +1531,7 @@
         </w:trPr>
         <w:tc>
           <w:tcPr>
-            <w:tcW w:type="dxa" w:w="2300"/>
+            <w:tcW w:type="dxa" w:w="2200"/>
             <w:tcBorders>
               <w:top w:val="single" w:color="C8D0C8" w:sz="4"/>
               <w:left w:val="single" w:color="C8D0C8" w:sz="4"/>
@@ -1563,7 +1563,7 @@
         </w:tc>
         <w:tc>
           <w:tcPr>
-            <w:tcW w:type="dxa" w:w="2350"/>
+            <w:tcW w:type="dxa" w:w="2300"/>
             <w:tcBorders>
               <w:top w:val="single" w:color="C8D0C8" w:sz="4"/>
               <w:left w:val="single" w:color="C8D0C8" w:sz="4"/>
@@ -1595,7 +1595,7 @@
         </w:tc>
         <w:tc>
           <w:tcPr>
-            <w:tcW w:type="dxa" w:w="1200"/>
+            <w:tcW w:type="dxa" w:w="1500"/>
             <w:tcBorders>
               <w:top w:val="single" w:color="C8D0C8" w:sz="4"/>
               <w:left w:val="single" w:color="C8D0C8" w:sz="4"/>
@@ -1627,7 +1627,7 @@
         </w:tc>
         <w:tc>
           <w:tcPr>
-            <w:tcW w:type="dxa" w:w="3176"/>
+            <w:tcW w:type="dxa" w:w="3026"/>
             <w:tcBorders>
               <w:top w:val="single" w:color="C8D0C8" w:sz="4"/>
               <w:left w:val="single" w:color="C8D0C8" w:sz="4"/>
@@ -1675,7 +1675,7 @@
         </w:trPr>
         <w:tc>
           <w:tcPr>
-            <w:tcW w:type="dxa" w:w="2300"/>
+            <w:tcW w:type="dxa" w:w="2200"/>
             <w:tcBorders>
               <w:top w:val="single" w:color="C8D0C8" w:sz="4"/>
               <w:left w:val="single" w:color="C8D0C8" w:sz="4"/>
@@ -1707,7 +1707,7 @@
         </w:tc>
         <w:tc>
           <w:tcPr>
-            <w:tcW w:type="dxa" w:w="2350"/>
+            <w:tcW w:type="dxa" w:w="2300"/>
             <w:tcBorders>
               <w:top w:val="single" w:color="C8D0C8" w:sz="4"/>
               <w:left w:val="single" w:color="C8D0C8" w:sz="4"/>
@@ -1739,7 +1739,7 @@
         </w:tc>
         <w:tc>
           <w:tcPr>
-            <w:tcW w:type="dxa" w:w="1200"/>
+            <w:tcW w:type="dxa" w:w="1500"/>
             <w:tcBorders>
               <w:top w:val="single" w:color="C8D0C8" w:sz="4"/>
               <w:left w:val="single" w:color="C8D0C8" w:sz="4"/>
@@ -1771,7 +1771,7 @@
         </w:tc>
         <w:tc>
           <w:tcPr>
-            <w:tcW w:type="dxa" w:w="3176"/>
+            <w:tcW w:type="dxa" w:w="3026"/>
             <w:tcBorders>
               <w:top w:val="single" w:color="C8D0C8" w:sz="4"/>
               <w:left w:val="single" w:color="C8D0C8" w:sz="4"/>
@@ -1819,7 +1819,7 @@
         </w:trPr>
         <w:tc>
           <w:tcPr>
-            <w:tcW w:type="dxa" w:w="2300"/>
+            <w:tcW w:type="dxa" w:w="2200"/>
             <w:tcBorders>
               <w:top w:val="single" w:color="C8D0C8" w:sz="4"/>
               <w:left w:val="single" w:color="C8D0C8" w:sz="4"/>
@@ -1851,7 +1851,7 @@
         </w:tc>
         <w:tc>
           <w:tcPr>
-            <w:tcW w:type="dxa" w:w="2350"/>
+            <w:tcW w:type="dxa" w:w="2300"/>
             <w:tcBorders>
               <w:top w:val="single" w:color="C8D0C8" w:sz="4"/>
               <w:left w:val="single" w:color="C8D0C8" w:sz="4"/>
@@ -1883,7 +1883,7 @@
         </w:tc>
         <w:tc>
           <w:tcPr>
-            <w:tcW w:type="dxa" w:w="1200"/>
+            <w:tcW w:type="dxa" w:w="1500"/>
             <w:tcBorders>
               <w:top w:val="single" w:color="C8D0C8" w:sz="4"/>
               <w:left w:val="single" w:color="C8D0C8" w:sz="4"/>
@@ -1915,7 +1915,7 @@
         </w:tc>
         <w:tc>
           <w:tcPr>
-            <w:tcW w:type="dxa" w:w="3176"/>
+            <w:tcW w:type="dxa" w:w="3026"/>
             <w:tcBorders>
               <w:top w:val="single" w:color="C8D0C8" w:sz="4"/>
               <w:left w:val="single" w:color="C8D0C8" w:sz="4"/>
@@ -1974,7 +1974,7 @@
         </w:trPr>
         <w:tc>
           <w:tcPr>
-            <w:tcW w:type="dxa" w:w="2300"/>
+            <w:tcW w:type="dxa" w:w="2200"/>
             <w:tcBorders>
               <w:top w:val="single" w:color="C8D0C8" w:sz="4"/>
               <w:left w:val="single" w:color="C8D0C8" w:sz="4"/>
@@ -2006,7 +2006,7 @@
         </w:tc>
         <w:tc>
           <w:tcPr>
-            <w:tcW w:type="dxa" w:w="2350"/>
+            <w:tcW w:type="dxa" w:w="2300"/>
             <w:tcBorders>
               <w:top w:val="single" w:color="C8D0C8" w:sz="4"/>
               <w:left w:val="single" w:color="C8D0C8" w:sz="4"/>
@@ -2038,7 +2038,7 @@
         </w:tc>
         <w:tc>
           <w:tcPr>
-            <w:tcW w:type="dxa" w:w="1200"/>
+            <w:tcW w:type="dxa" w:w="1500"/>
             <w:tcBorders>
               <w:top w:val="single" w:color="C8D0C8" w:sz="4"/>
               <w:left w:val="single" w:color="C8D0C8" w:sz="4"/>
@@ -2064,13 +2064,13 @@
                 <w:sz w:val="19"/>
                 <w:szCs w:val="19"/>
               </w:rPr>
-              <w:t xml:space="preserve">ACN</w:t>
-            </w:r>
-          </w:p>
-        </w:tc>
-        <w:tc>
-          <w:tcPr>
-            <w:tcW w:type="dxa" w:w="3176"/>
+              <w:t xml:space="preserve">ACN (later APC)</w:t>
+            </w:r>
+          </w:p>
+        </w:tc>
+        <w:tc>
+          <w:tcPr>
+            <w:tcW w:type="dxa" w:w="3026"/>
             <w:tcBorders>
               <w:top w:val="single" w:color="C8D0C8" w:sz="4"/>
               <w:left w:val="single" w:color="C8D0C8" w:sz="4"/>
@@ -2129,7 +2129,7 @@
         </w:trPr>
         <w:tc>
           <w:tcPr>
-            <w:tcW w:type="dxa" w:w="2300"/>
+            <w:tcW w:type="dxa" w:w="2200"/>
             <w:tcBorders>
               <w:top w:val="single" w:color="C8D0C8" w:sz="4"/>
               <w:left w:val="single" w:color="C8D0C8" w:sz="4"/>
@@ -2161,7 +2161,7 @@
         </w:tc>
         <w:tc>
           <w:tcPr>
-            <w:tcW w:type="dxa" w:w="2350"/>
+            <w:tcW w:type="dxa" w:w="2300"/>
             <w:tcBorders>
               <w:top w:val="single" w:color="C8D0C8" w:sz="4"/>
               <w:left w:val="single" w:color="C8D0C8" w:sz="4"/>
@@ -2193,7 +2193,7 @@
         </w:tc>
         <w:tc>
           <w:tcPr>
-            <w:tcW w:type="dxa" w:w="1200"/>
+            <w:tcW w:type="dxa" w:w="1500"/>
             <w:tcBorders>
               <w:top w:val="single" w:color="C8D0C8" w:sz="4"/>
               <w:left w:val="single" w:color="C8D0C8" w:sz="4"/>
@@ -2225,7 +2225,7 @@
         </w:tc>
         <w:tc>
           <w:tcPr>
-            <w:tcW w:type="dxa" w:w="3176"/>
+            <w:tcW w:type="dxa" w:w="3026"/>
             <w:tcBorders>
               <w:top w:val="single" w:color="C8D0C8" w:sz="4"/>
               <w:left w:val="single" w:color="C8D0C8" w:sz="4"/>
@@ -2273,7 +2273,7 @@
         </w:trPr>
         <w:tc>
           <w:tcPr>
-            <w:tcW w:type="dxa" w:w="2300"/>
+            <w:tcW w:type="dxa" w:w="2200"/>
             <w:tcBorders>
               <w:top w:val="single" w:color="C8D0C8" w:sz="4"/>
               <w:left w:val="single" w:color="C8D0C8" w:sz="4"/>
@@ -2305,7 +2305,7 @@
         </w:tc>
         <w:tc>
           <w:tcPr>
-            <w:tcW w:type="dxa" w:w="2350"/>
+            <w:tcW w:type="dxa" w:w="2300"/>
             <w:tcBorders>
               <w:top w:val="single" w:color="C8D0C8" w:sz="4"/>
               <w:left w:val="single" w:color="C8D0C8" w:sz="4"/>
@@ -2337,7 +2337,7 @@
         </w:tc>
         <w:tc>
           <w:tcPr>
-            <w:tcW w:type="dxa" w:w="1200"/>
+            <w:tcW w:type="dxa" w:w="1500"/>
             <w:tcBorders>
               <w:top w:val="single" w:color="C8D0C8" w:sz="4"/>
               <w:left w:val="single" w:color="C8D0C8" w:sz="4"/>
@@ -2369,7 +2369,7 @@
         </w:tc>
         <w:tc>
           <w:tcPr>
-            <w:tcW w:type="dxa" w:w="3176"/>
+            <w:tcW w:type="dxa" w:w="3026"/>
             <w:tcBorders>
               <w:top w:val="single" w:color="C8D0C8" w:sz="4"/>
               <w:left w:val="single" w:color="C8D0C8" w:sz="4"/>
@@ -2417,7 +2417,7 @@
         </w:trPr>
         <w:tc>
           <w:tcPr>
-            <w:tcW w:type="dxa" w:w="2300"/>
+            <w:tcW w:type="dxa" w:w="2200"/>
             <w:tcBorders>
               <w:top w:val="single" w:color="C8D0C8" w:sz="4"/>
               <w:left w:val="single" w:color="C8D0C8" w:sz="4"/>
@@ -2449,7 +2449,7 @@
         </w:tc>
         <w:tc>
           <w:tcPr>
-            <w:tcW w:type="dxa" w:w="2350"/>
+            <w:tcW w:type="dxa" w:w="2300"/>
             <w:tcBorders>
               <w:top w:val="single" w:color="C8D0C8" w:sz="4"/>
               <w:left w:val="single" w:color="C8D0C8" w:sz="4"/>
@@ -2481,7 +2481,7 @@
         </w:tc>
         <w:tc>
           <w:tcPr>
-            <w:tcW w:type="dxa" w:w="1200"/>
+            <w:tcW w:type="dxa" w:w="1500"/>
             <w:tcBorders>
               <w:top w:val="single" w:color="C8D0C8" w:sz="4"/>
               <w:left w:val="single" w:color="C8D0C8" w:sz="4"/>
@@ -2513,7 +2513,7 @@
         </w:tc>
         <w:tc>
           <w:tcPr>
-            <w:tcW w:type="dxa" w:w="3176"/>
+            <w:tcW w:type="dxa" w:w="3026"/>
             <w:tcBorders>
               <w:top w:val="single" w:color="C8D0C8" w:sz="4"/>
               <w:left w:val="single" w:color="C8D0C8" w:sz="4"/>
@@ -2933,7 +2933,7 @@
         <w:t xml:space="preserve">[48]</w:t>
       </w:r>
       <w:r>
-        <w:t xml:space="preserve"> Opponents argued that his 2006 impeachment made him ineligible; a THISDAY analysis reports that in April 2015 the Supreme Court held impeachment is not a ground for disqualification.</w:t>
+        <w:t xml:space="preserve"> Opponents argued that his 2006 impeachment made him ineligible. On 14 April 2015 the Supreme Court dismissed the APC's appeal; reports say it held that impeachment is not a ground for disqualification and that the 2006 impeachment panel was illegally constituted, though the judgment itself has not been read.</w:t>
       </w:r>
       <w:r>
         <w:rPr>
@@ -2952,10 +2952,7 @@
           <w:szCs w:val="16"/>
           <w:vertAlign w:val="superscript"/>
         </w:rPr>
-        <w:t xml:space="preserve">[7]</w:t>
-      </w:r>
-      <w:r>
-        <w:t xml:space="preserve"> Fayose's second term ran from 16 October 2014 to 16 October 2018, when Fayemi, now in the APC, began a second term that ran to October 2022.</w:t>
+        <w:t xml:space="preserve">[65]</w:t>
       </w:r>
       <w:r>
         <w:rPr>
@@ -2966,30 +2963,7 @@
           <w:szCs w:val="16"/>
           <w:vertAlign w:val="superscript"/>
         </w:rPr>
-        <w:t xml:space="preserve">[1]</w:t>
-      </w:r>
-    </w:p>
-    <w:p>
-      <w:pPr>
-        <w:pStyle w:val="Heading2"/>
-      </w:pPr>
-      <w:r>
-        <w:t xml:space="preserve">Oyebanji and a second mandate (2022–2026)</w:t>
-      </w:r>
-    </w:p>
-    <w:p>
-      <w:pPr>
-        <w:spacing w:after="120" w:line="292"/>
-      </w:pPr>
-      <w:r>
-        <w:rPr>
-          <w:b/>
-          <w:bCs/>
-        </w:rPr>
-        <w:t xml:space="preserve">Biodun Oyebanji</w:t>
-      </w:r>
-      <w:r>
-        <w:t xml:space="preserve"> of the APC was sworn in on 16 October 2022.</w:t>
+        <w:t xml:space="preserve">[66]</w:t>
       </w:r>
       <w:r>
         <w:rPr>
@@ -3000,18 +2974,10 @@
           <w:szCs w:val="16"/>
           <w:vertAlign w:val="superscript"/>
         </w:rPr>
-        <w:t xml:space="preserve">[55]</w:t>
-      </w:r>
-      <w:r>
-        <w:t xml:space="preserve"> The election was held on 18 June 2022, and he was reported as declared winner with 187,057 votes; runner-up Segun Oni filed a petition challenging the result, whose outcome has not been checked.</w:t>
-      </w:r>
-      <w:r>
-        <w:rPr>
-          <w:b/>
-          <w:bCs/>
-          <w:color w:val="B8860B"/>
-        </w:rPr>
-        <w:t xml:space="preserve">†</w:t>
+        <w:t xml:space="preserve">[7]</w:t>
+      </w:r>
+      <w:r>
+        <w:t xml:space="preserve"> Fayose's second term ran from 16 October 2014 to 16 October 2018, when Fayemi, now in the APC, began a second term that ran to October 2022.</w:t>
       </w:r>
       <w:r>
         <w:rPr>
@@ -3022,33 +2988,30 @@
           <w:szCs w:val="16"/>
           <w:vertAlign w:val="superscript"/>
         </w:rPr>
-        <w:t xml:space="preserve">[56]</w:t>
+        <w:t xml:space="preserve">[1]</w:t>
       </w:r>
     </w:p>
     <w:p>
       <w:pPr>
+        <w:pStyle w:val="Heading2"/>
+      </w:pPr>
+      <w:r>
+        <w:t xml:space="preserve">Oyebanji and a second mandate (2022–2026)</w:t>
+      </w:r>
+    </w:p>
+    <w:p>
+      <w:pPr>
         <w:spacing w:after="120" w:line="292"/>
       </w:pPr>
       <w:r>
-        <w:t xml:space="preserve">Oyebanji faced voters again on 20 June 2026. On 21 June INEC's chief returning officer declared him winner with </w:t>
-      </w:r>
-      <w:r>
-        <w:rPr>
-          <w:b/>
-          <w:bCs/>
-        </w:rPr>
-        <w:t xml:space="preserve">319,224 votes</w:t>
-      </w:r>
-      <w:r>
-        <w:t xml:space="preserve">, against 40,543 for Wole Oluyede (PDP) and 12,872 for Dare Bejide (ADC), according to Channels TV and Pulse Nigeria; INEC's own declaration document has not yet been consulted.</w:t>
-      </w:r>
-      <w:r>
-        <w:rPr>
-          <w:b/>
-          <w:bCs/>
-          <w:color w:val="B8860B"/>
-        </w:rPr>
-        <w:t xml:space="preserve">†</w:t>
+        <w:rPr>
+          <w:b/>
+          <w:bCs/>
+        </w:rPr>
+        <w:t xml:space="preserve">Biodun Oyebanji</w:t>
+      </w:r>
+      <w:r>
+        <w:t xml:space="preserve"> of the APC was sworn in on 16 October 2022.</w:t>
       </w:r>
       <w:r>
         <w:rPr>
@@ -3059,7 +3022,10 @@
           <w:szCs w:val="16"/>
           <w:vertAlign w:val="superscript"/>
         </w:rPr>
-        <w:t xml:space="preserve">[11]</w:t>
+        <w:t xml:space="preserve">[55]</w:t>
+      </w:r>
+      <w:r>
+        <w:t xml:space="preserve"> In INEC's declaration for the 18 June 2022 election he was declared elected with 187,057 votes, ahead of Segun Oni (SDP) with 82,211 and Bisi Kolawole (PDP) with 67,457.</w:t>
       </w:r>
       <w:r>
         <w:rPr>
@@ -3070,15 +3036,10 @@
           <w:szCs w:val="16"/>
           <w:vertAlign w:val="superscript"/>
         </w:rPr>
-        <w:t xml:space="preserve">[54]</w:t>
-      </w:r>
-    </w:p>
-    <w:p>
-      <w:pPr>
-        <w:spacing w:after="120" w:line="292"/>
-      </w:pPr>
-      <w:r>
-        <w:t xml:space="preserve">Reported claims and disputes are kept apart from the result. The ADC candidate alleged irregularities, which Oyebanji rejected,</w:t>
+        <w:t xml:space="preserve">[71]</w:t>
+      </w:r>
+      <w:r>
+        <w:t xml:space="preserve"> Oni filed a petition challenging the result; its outcome has not been checked.</w:t>
       </w:r>
       <w:r>
         <w:rPr>
@@ -3097,18 +3058,25 @@
           <w:szCs w:val="16"/>
           <w:vertAlign w:val="superscript"/>
         </w:rPr>
-        <w:t xml:space="preserve">[11]</w:t>
-      </w:r>
-      <w:r>
-        <w:t xml:space="preserve"> and observers' concerns about vote-buying and intimidation were reported.</w:t>
-      </w:r>
-      <w:r>
-        <w:rPr>
-          <w:b/>
-          <w:bCs/>
-          <w:color w:val="1F5FA8"/>
-        </w:rPr>
-        <w:t xml:space="preserve">‡</w:t>
+        <w:t xml:space="preserve">[56]</w:t>
+      </w:r>
+    </w:p>
+    <w:p>
+      <w:pPr>
+        <w:spacing w:after="120" w:line="292"/>
+      </w:pPr>
+      <w:r>
+        <w:t xml:space="preserve">Oyebanji faced voters again on 20 June 2026. At about 3:13 a.m. on Sunday 21 June, INEC's State Returning Officer, Prof. Adenike Oladiji, declared him winner with </w:t>
+      </w:r>
+      <w:r>
+        <w:rPr>
+          <w:b/>
+          <w:bCs/>
+        </w:rPr>
+        <w:t xml:space="preserve">319,224 votes</w:t>
+      </w:r>
+      <w:r>
+        <w:t xml:space="preserve">, against 40,543 for Wole Oluyede (PDP) and 12,872 for Dare Bejide (ADC), with 375,777 valid and 6,332 rejected votes, according to Channels TV, Vanguard and Daily Trust.</w:t>
       </w:r>
       <w:r>
         <w:rPr>
@@ -3119,18 +3087,7 @@
           <w:szCs w:val="16"/>
           <w:vertAlign w:val="superscript"/>
         </w:rPr>
-        <w:t xml:space="preserve">[36]</w:t>
-      </w:r>
-      <w:r>
-        <w:t xml:space="preserve"> Media reports describe him as the first governor re-elected back to back since the state's creation,</w:t>
-      </w:r>
-      <w:r>
-        <w:rPr>
-          <w:b/>
-          <w:bCs/>
-          <w:color w:val="1F5FA8"/>
-        </w:rPr>
-        <w:t xml:space="preserve">‡</w:t>
+        <w:t xml:space="preserve">[11]</w:t>
       </w:r>
       <w:r>
         <w:rPr>
@@ -3141,18 +3098,7 @@
           <w:szCs w:val="16"/>
           <w:vertAlign w:val="superscript"/>
         </w:rPr>
-        <w:t xml:space="preserve">[12]</w:t>
-      </w:r>
-      <w:r>
-        <w:t xml:space="preserve"> and one outlet says no incumbent had won a second term since Adebayo.</w:t>
-      </w:r>
-      <w:r>
-        <w:rPr>
-          <w:b/>
-          <w:bCs/>
-          <w:color w:val="1F5FA8"/>
-        </w:rPr>
-        <w:t xml:space="preserve">‡</w:t>
+        <w:t xml:space="preserve">[72]</w:t>
       </w:r>
       <w:r>
         <w:rPr>
@@ -3163,10 +3109,183 @@
           <w:szCs w:val="16"/>
           <w:vertAlign w:val="superscript"/>
         </w:rPr>
+        <w:t xml:space="preserve">[67]</w:t>
+      </w:r>
+      <w:r>
+        <w:t xml:space="preserve"> The party totals published by ThisDay's live updates add up to the valid-vote figure only if the PDP total is 40,543, so the 40,533 printed by a few outlets is almost certainly a typographical error.</w:t>
+      </w:r>
+      <w:r>
+        <w:rPr>
+          <w:b w:val="false"/>
+          <w:bCs w:val="false"/>
+          <w:color w:val="6B7280"/>
+          <w:sz w:val="16"/>
+          <w:szCs w:val="16"/>
+          <w:vertAlign w:val="superscript"/>
+        </w:rPr>
+        <w:t xml:space="preserve">[73]</w:t>
+      </w:r>
+      <w:r>
+        <w:t xml:space="preserve"> INEC's own declaration document (Form EC8E) has not yet been consulted, so the result is still marked as awaiting a primary record.</w:t>
+      </w:r>
+      <w:r>
+        <w:rPr>
+          <w:b/>
+          <w:bCs/>
+          <w:color w:val="B8860B"/>
+        </w:rPr>
+        <w:t xml:space="preserve">†</w:t>
+      </w:r>
+      <w:r>
+        <w:rPr>
+          <w:b w:val="false"/>
+          <w:bCs w:val="false"/>
+          <w:color w:val="6B7280"/>
+          <w:sz w:val="16"/>
+          <w:szCs w:val="16"/>
+          <w:vertAlign w:val="superscript"/>
+        </w:rPr>
+        <w:t xml:space="preserve">[70]</w:t>
+      </w:r>
+    </w:p>
+    <w:p>
+      <w:pPr>
+        <w:spacing w:after="120" w:line="292"/>
+      </w:pPr>
+      <w:r>
+        <w:t xml:space="preserve">Reported claims and disputes are kept apart from the result. The ADC candidate alleged irregularities, which Oyebanji rejected,</w:t>
+      </w:r>
+      <w:r>
+        <w:rPr>
+          <w:b/>
+          <w:bCs/>
+          <w:color w:val="1F5FA8"/>
+        </w:rPr>
+        <w:t xml:space="preserve">‡</w:t>
+      </w:r>
+      <w:r>
+        <w:rPr>
+          <w:b w:val="false"/>
+          <w:bCs w:val="false"/>
+          <w:color w:val="6B7280"/>
+          <w:sz w:val="16"/>
+          <w:szCs w:val="16"/>
+          <w:vertAlign w:val="superscript"/>
+        </w:rPr>
+        <w:t xml:space="preserve">[11]</w:t>
+      </w:r>
+      <w:r>
+        <w:t xml:space="preserve"> observers' concerns about vote-buying and intimidation were reported,</w:t>
+      </w:r>
+      <w:r>
+        <w:rPr>
+          <w:b/>
+          <w:bCs/>
+          <w:color w:val="1F5FA8"/>
+        </w:rPr>
+        <w:t xml:space="preserve">‡</w:t>
+      </w:r>
+      <w:r>
+        <w:rPr>
+          <w:b w:val="false"/>
+          <w:bCs w:val="false"/>
+          <w:color w:val="6B7280"/>
+          <w:sz w:val="16"/>
+          <w:szCs w:val="16"/>
+          <w:vertAlign w:val="superscript"/>
+        </w:rPr>
         <w:t xml:space="preserve">[36]</w:t>
       </w:r>
       <w:r>
-        <w:t xml:space="preserve"> This characterisation is not yet confirmed against INEC or other historical records. Oyebanji's current term runs to October 2026.</w:t>
+        <w:t xml:space="preserve"> and Yiaga Africa's observation mission raised concerns about the consistency of the materials INEC deployed after late candidate-list changes.</w:t>
+      </w:r>
+      <w:r>
+        <w:rPr>
+          <w:b/>
+          <w:bCs/>
+          <w:color w:val="1F5FA8"/>
+        </w:rPr>
+        <w:t xml:space="preserve">‡</w:t>
+      </w:r>
+      <w:r>
+        <w:rPr>
+          <w:b w:val="false"/>
+          <w:bCs w:val="false"/>
+          <w:color w:val="6B7280"/>
+          <w:sz w:val="16"/>
+          <w:szCs w:val="16"/>
+          <w:vertAlign w:val="superscript"/>
+        </w:rPr>
+        <w:t xml:space="preserve">[11]</w:t>
+      </w:r>
+      <w:r>
+        <w:t xml:space="preserve"> Premium Times and allAfrica describe him as the first Ekiti governor to secure consecutive re-election, and Dataphyte notes that no incumbent had won a second consecutive term before.</w:t>
+      </w:r>
+      <w:r>
+        <w:rPr>
+          <w:b/>
+          <w:bCs/>
+          <w:color w:val="1F5FA8"/>
+        </w:rPr>
+        <w:t xml:space="preserve">‡</w:t>
+      </w:r>
+      <w:r>
+        <w:rPr>
+          <w:b w:val="false"/>
+          <w:bCs w:val="false"/>
+          <w:color w:val="6B7280"/>
+          <w:sz w:val="16"/>
+          <w:szCs w:val="16"/>
+          <w:vertAlign w:val="superscript"/>
+        </w:rPr>
+        <w:t xml:space="preserve">[68]</w:t>
+      </w:r>
+      <w:r>
+        <w:rPr>
+          <w:b w:val="false"/>
+          <w:bCs w:val="false"/>
+          <w:color w:val="6B7280"/>
+          <w:sz w:val="16"/>
+          <w:szCs w:val="16"/>
+          <w:vertAlign w:val="superscript"/>
+        </w:rPr>
+        <w:t xml:space="preserve">[12]</w:t>
+      </w:r>
+      <w:r>
+        <w:rPr>
+          <w:b w:val="false"/>
+          <w:bCs w:val="false"/>
+          <w:color w:val="6B7280"/>
+          <w:sz w:val="16"/>
+          <w:szCs w:val="16"/>
+          <w:vertAlign w:val="superscript"/>
+        </w:rPr>
+        <w:t xml:space="preserve">[69]</w:t>
+      </w:r>
+      <w:r>
+        <w:t xml:space="preserve"> Before the vote, Legit.ng and allAfrica noted that no incumbent had won re-election since the 1999 return to elected government, and that Adebayo, the first governor, served a single term.</w:t>
+      </w:r>
+      <w:r>
+        <w:rPr>
+          <w:b/>
+          <w:bCs/>
+          <w:color w:val="1F5FA8"/>
+        </w:rPr>
+        <w:t xml:space="preserve">‡</w:t>
+      </w:r>
+      <w:r>
+        <w:rPr>
+          <w:b w:val="false"/>
+          <w:bCs w:val="false"/>
+          <w:color w:val="6B7280"/>
+          <w:sz w:val="16"/>
+          <w:szCs w:val="16"/>
+          <w:vertAlign w:val="superscript"/>
+        </w:rPr>
+        <w:t xml:space="preserve">[36]</w:t>
+      </w:r>
+      <w:r>
+        <w:t xml:space="preserve"> These are media characterisations, not INEC statements, and they are not confirmed against INEC or other historical records. As of September 2026, Oyebanji's current term runs to October 2026.</w:t>
       </w:r>
     </w:p>
     <w:p>
@@ -4708,7 +4827,7 @@
         <w:t xml:space="preserve">[32]</w:t>
       </w:r>
       <w:r>
-        <w:t xml:space="preserve"> In June 2026 voters returned Governor Oyebanji, which media reports describe as the first consecutive-term win in the state's history.</w:t>
+        <w:t xml:space="preserve"> In June 2026 voters returned Governor Oyebanji, which media reports describe as the first consecutive re-election of a governor in the state.</w:t>
       </w:r>
       <w:r>
         <w:rPr>
@@ -4717,6 +4836,17 @@
           <w:color w:val="1F5FA8"/>
         </w:rPr>
         <w:t xml:space="preserve">‡</w:t>
+      </w:r>
+      <w:r>
+        <w:rPr>
+          <w:b w:val="false"/>
+          <w:bCs w:val="false"/>
+          <w:color w:val="6B7280"/>
+          <w:sz w:val="16"/>
+          <w:szCs w:val="16"/>
+          <w:vertAlign w:val="superscript"/>
+        </w:rPr>
+        <w:t xml:space="preserve">[68]</w:t>
       </w:r>
       <w:r>
         <w:rPr>
@@ -7936,7 +8066,7 @@
                 <w:sz w:val="18"/>
                 <w:szCs w:val="18"/>
               </w:rPr>
-              <w:t xml:space="preserve">Fayose declared winner of governorship election, defeating incumbent Fayemi</w:t>
+              <w:t xml:space="preserve">Fayose wins 2014 governorship election, defeating incumbent Fayemi</w:t>
             </w:r>
           </w:p>
         </w:tc>
@@ -8303,7 +8433,7 @@
                 <w:sz w:val="18"/>
                 <w:szCs w:val="18"/>
               </w:rPr>
-              <w:t xml:space="preserve">Apr 2015 (day not confirmed)</w:t>
+              <w:t xml:space="preserve">14 Apr 2015</w:t>
             </w:r>
           </w:p>
         </w:tc>
@@ -8335,7 +8465,7 @@
                 <w:sz w:val="18"/>
                 <w:szCs w:val="18"/>
               </w:rPr>
-              <w:t xml:space="preserve">Supreme Court rules on Fayose's eligibility</w:t>
+              <w:t xml:space="preserve">Supreme Court dismisses APC appeal, affirming Fayose's 2014 victory</w:t>
             </w:r>
           </w:p>
         </w:tc>
@@ -9665,7 +9795,7 @@
                 <w:sz w:val="18"/>
                 <w:szCs w:val="18"/>
               </w:rPr>
-              <w:t xml:space="preserve">Oyebanji declared winner of governorship election</w:t>
+              <w:t xml:space="preserve">Oyebanji declared winner of 2022 governorship election</w:t>
             </w:r>
           </w:p>
         </w:tc>
@@ -9697,7 +9827,7 @@
                 <w:sz w:val="18"/>
                 <w:szCs w:val="18"/>
               </w:rPr>
-              <w:t xml:space="preserve">Needs primary</w:t>
+              <w:t xml:space="preserve">Verified</w:t>
             </w:r>
           </w:p>
         </w:tc>
@@ -12478,7 +12608,7 @@
                 <w:sz w:val="18"/>
                 <w:szCs w:val="18"/>
               </w:rPr>
-              <w:t xml:space="preserve">Correct; the day is disputed (15 or 16 Oct). The April 2015 Supreme Court ruling still needs the judgment.</w:t>
+              <w:t xml:space="preserve">Correct; the day is disputed (15 or 16 Oct). The 14 April 2015 Supreme Court ruling is reported by two outlets; the judgment itself is still needed.</w:t>
             </w:r>
           </w:p>
         </w:tc>
@@ -13079,7 +13209,7 @@
         <w:t xml:space="preserve">INEC records:</w:t>
       </w:r>
       <w:r>
-        <w:t xml:space="preserve"> the 2018, 2022 and 2026 declarations still need to be read from INEC's own posts or documents (2014 obtained).</w:t>
+        <w:t xml:space="preserve"> the 2018 and 2026 declarations still need to be read from INEC's own posts or documents (2014 and 2022 obtained).</w:t>
       </w:r>
     </w:p>
     <w:p>
@@ -13167,7 +13297,7 @@
         <w:tabs>
           <w:tab w:val="left" w:pos="500"/>
         </w:tabs>
-        <w:spacing w:after="90" w:line="264"/>
+        <w:spacing w:after="60" w:line="250"/>
         <w:ind w:left="500" w:hanging="500"/>
       </w:pPr>
       <w:r>
@@ -13187,7 +13317,7 @@
         </w:rPr>
         <w:t xml:space="preserve">Ekiti State Government: Past Governors. </w:t>
       </w:r>
-      <w:hyperlink w:history="1" r:id="rId52wlyfccm0rzhnha_divy">
+      <w:hyperlink w:history="1" r:id="rIdgvebpzwnkk1uu_pmmf0v5">
         <w:r>
           <w:rPr>
             <w:color w:val="1F5FA8"/>
@@ -13204,7 +13334,7 @@
         <w:tabs>
           <w:tab w:val="left" w:pos="500"/>
         </w:tabs>
-        <w:spacing w:after="90" w:line="264"/>
+        <w:spacing w:after="60" w:line="250"/>
         <w:ind w:left="500" w:hanging="500"/>
       </w:pPr>
       <w:r>
@@ -13224,7 +13354,7 @@
         </w:rPr>
         <w:t xml:space="preserve">Wikipedia: List of governors of Ekiti State. </w:t>
       </w:r>
-      <w:hyperlink w:history="1" r:id="rIdhzyl36wfl60_shmto6v_r">
+      <w:hyperlink w:history="1" r:id="rIdfm9dyzelptyi5pjaawgvo">
         <w:r>
           <w:rPr>
             <w:color w:val="1F5FA8"/>
@@ -13241,7 +13371,7 @@
         <w:tabs>
           <w:tab w:val="left" w:pos="500"/>
         </w:tabs>
-        <w:spacing w:after="90" w:line="264"/>
+        <w:spacing w:after="60" w:line="250"/>
         <w:ind w:left="500" w:hanging="500"/>
       </w:pPr>
       <w:r>
@@ -13261,7 +13391,7 @@
         </w:rPr>
         <w:t xml:space="preserve">Wikipedia: Mohammed Bawa. </w:t>
       </w:r>
-      <w:hyperlink w:history="1" r:id="rIdvycjvv0zwg1lz4t_qiefl">
+      <w:hyperlink w:history="1" r:id="rId3-ymam0xaq4bs66qi2dnq">
         <w:r>
           <w:rPr>
             <w:color w:val="1F5FA8"/>
@@ -13278,7 +13408,7 @@
         <w:tabs>
           <w:tab w:val="left" w:pos="500"/>
         </w:tabs>
-        <w:spacing w:after="90" w:line="264"/>
+        <w:spacing w:after="60" w:line="250"/>
         <w:ind w:left="500" w:hanging="500"/>
       </w:pPr>
       <w:r>
@@ -13298,7 +13428,7 @@
         </w:rPr>
         <w:t xml:space="preserve">Wikipedia: Atanda Yusuf. </w:t>
       </w:r>
-      <w:hyperlink w:history="1" r:id="rId866fncwflngsyh2ugirl5">
+      <w:hyperlink w:history="1" r:id="rIdaqaafhr79metcsjjoac2n">
         <w:r>
           <w:rPr>
             <w:color w:val="1F5FA8"/>
@@ -13315,7 +13445,7 @@
         <w:tabs>
           <w:tab w:val="left" w:pos="500"/>
         </w:tabs>
-        <w:spacing w:after="90" w:line="264"/>
+        <w:spacing w:after="60" w:line="250"/>
         <w:ind w:left="500" w:hanging="500"/>
       </w:pPr>
       <w:r>
@@ -13335,7 +13465,7 @@
         </w:rPr>
         <w:t xml:space="preserve">Wikipedia: Niyi Adebayo. </w:t>
       </w:r>
-      <w:hyperlink w:history="1" r:id="rId7osuoyjaxa0q-xucj483l">
+      <w:hyperlink w:history="1" r:id="rId5f6nshsrwrwzfghw6bur_">
         <w:r>
           <w:rPr>
             <w:color w:val="1F5FA8"/>
@@ -13352,7 +13482,7 @@
         <w:tabs>
           <w:tab w:val="left" w:pos="500"/>
         </w:tabs>
-        <w:spacing w:after="90" w:line="264"/>
+        <w:spacing w:after="60" w:line="250"/>
         <w:ind w:left="500" w:hanging="500"/>
       </w:pPr>
       <w:r>
@@ -13372,7 +13502,7 @@
         </w:rPr>
         <w:t xml:space="preserve">Wikipedia: Tunji Olurin. </w:t>
       </w:r>
-      <w:hyperlink w:history="1" r:id="rIdhuz_y_sa0ty5d45dnftft">
+      <w:hyperlink w:history="1" r:id="rIdhlvlngx7qhfpqdokmguam">
         <w:r>
           <w:rPr>
             <w:color w:val="1F5FA8"/>
@@ -13389,7 +13519,7 @@
         <w:tabs>
           <w:tab w:val="left" w:pos="500"/>
         </w:tabs>
-        <w:spacing w:after="90" w:line="264"/>
+        <w:spacing w:after="60" w:line="250"/>
         <w:ind w:left="500" w:hanging="500"/>
       </w:pPr>
       <w:r>
@@ -13409,7 +13539,7 @@
         </w:rPr>
         <w:t xml:space="preserve">THISDAY: "The Judiciary as an Impediment" (2017). </w:t>
       </w:r>
-      <w:hyperlink w:history="1" r:id="rIdlppzby0lh4_5fl2proaod">
+      <w:hyperlink w:history="1" r:id="rIdzdu3z234wy-xezlxlkd2r">
         <w:r>
           <w:rPr>
             <w:color w:val="1F5FA8"/>
@@ -13426,7 +13556,7 @@
         <w:tabs>
           <w:tab w:val="left" w:pos="500"/>
         </w:tabs>
-        <w:spacing w:after="90" w:line="264"/>
+        <w:spacing w:after="60" w:line="250"/>
         <w:ind w:left="500" w:hanging="500"/>
       </w:pPr>
       <w:r>
@@ -13446,7 +13576,7 @@
         </w:rPr>
         <w:t xml:space="preserve">Wikipedia: Olusegun Oni. </w:t>
       </w:r>
-      <w:hyperlink w:history="1" r:id="rIdunxtacwf_kuavgks_rjky">
+      <w:hyperlink w:history="1" r:id="rIdhggqy3s90g9knu1gwkhfh">
         <w:r>
           <w:rPr>
             <w:color w:val="1F5FA8"/>
@@ -13463,7 +13593,7 @@
         <w:tabs>
           <w:tab w:val="left" w:pos="500"/>
         </w:tabs>
-        <w:spacing w:after="90" w:line="264"/>
+        <w:spacing w:after="60" w:line="250"/>
         <w:ind w:left="500" w:hanging="500"/>
       </w:pPr>
       <w:r>
@@ -13483,7 +13613,7 @@
         </w:rPr>
         <w:t xml:space="preserve">Wikipedia: Kayode Fayemi. </w:t>
       </w:r>
-      <w:hyperlink w:history="1" r:id="rIdhfmyv_jo27pu7_r_8wlos">
+      <w:hyperlink w:history="1" r:id="rId-ediabjwuxe-ilo7-tnhk">
         <w:r>
           <w:rPr>
             <w:color w:val="1F5FA8"/>
@@ -13500,7 +13630,7 @@
         <w:tabs>
           <w:tab w:val="left" w:pos="500"/>
         </w:tabs>
-        <w:spacing w:after="90" w:line="264"/>
+        <w:spacing w:after="60" w:line="250"/>
         <w:ind w:left="500" w:hanging="500"/>
       </w:pPr>
       <w:r>
@@ -13520,7 +13650,7 @@
         </w:rPr>
         <w:t xml:space="preserve">Wikipedia: Ayo Fayose. </w:t>
       </w:r>
-      <w:hyperlink w:history="1" r:id="rIdvnnkk4rkdemx0vogxiify">
+      <w:hyperlink w:history="1" r:id="rIdkirr27jrohnxl47ajxgiy">
         <w:r>
           <w:rPr>
             <w:color w:val="1F5FA8"/>
@@ -13537,7 +13667,7 @@
         <w:tabs>
           <w:tab w:val="left" w:pos="500"/>
         </w:tabs>
-        <w:spacing w:after="90" w:line="264"/>
+        <w:spacing w:after="60" w:line="250"/>
         <w:ind w:left="500" w:hanging="500"/>
       </w:pPr>
       <w:r>
@@ -13557,7 +13687,7 @@
         </w:rPr>
         <w:t xml:space="preserve">Channels TV: INEC declares Oyebanji winner (21 Jun 2026). </w:t>
       </w:r>
-      <w:hyperlink w:history="1" r:id="rIdtrvo0-6roayibyv54xxq3">
+      <w:hyperlink w:history="1" r:id="rIdck1mug-dyf8lcyk93xxoj">
         <w:r>
           <w:rPr>
             <w:color w:val="1F5FA8"/>
@@ -13574,7 +13704,7 @@
         <w:tabs>
           <w:tab w:val="left" w:pos="500"/>
         </w:tabs>
-        <w:spacing w:after="90" w:line="264"/>
+        <w:spacing w:after="60" w:line="250"/>
         <w:ind w:left="500" w:hanging="500"/>
       </w:pPr>
       <w:r>
@@ -13594,7 +13724,7 @@
         </w:rPr>
         <w:t xml:space="preserve">allAfrica: Oyebanji makes history (22 Jun 2026). </w:t>
       </w:r>
-      <w:hyperlink w:history="1" r:id="rIdbindnvgipbldpbfarou7m">
+      <w:hyperlink w:history="1" r:id="rIdqhbgsm8qjlzvi3m20yeg9">
         <w:r>
           <w:rPr>
             <w:color w:val="1F5FA8"/>
@@ -13611,7 +13741,7 @@
         <w:tabs>
           <w:tab w:val="left" w:pos="500"/>
         </w:tabs>
-        <w:spacing w:after="90" w:line="264"/>
+        <w:spacing w:after="60" w:line="250"/>
         <w:ind w:left="500" w:hanging="500"/>
       </w:pPr>
       <w:r>
@@ -13631,7 +13761,7 @@
         </w:rPr>
         <w:t xml:space="preserve">Dataphyte: Ekiti Governorship Election 2026. </w:t>
       </w:r>
-      <w:hyperlink w:history="1" r:id="rIdhsc-9fipn1x-98pptztvp">
+      <w:hyperlink w:history="1" r:id="rIdjltux_4zkssv8fkf4cr1l">
         <w:r>
           <w:rPr>
             <w:color w:val="1F5FA8"/>
@@ -13648,7 +13778,7 @@
         <w:tabs>
           <w:tab w:val="left" w:pos="500"/>
         </w:tabs>
-        <w:spacing w:after="90" w:line="264"/>
+        <w:spacing w:after="60" w:line="250"/>
         <w:ind w:left="500" w:hanging="500"/>
       </w:pPr>
       <w:r>
@@ -13668,7 +13798,7 @@
         </w:rPr>
         <w:t xml:space="preserve">Ekiti State Government: The re-birth of Ikogosi Warm Springs Resort. </w:t>
       </w:r>
-      <w:hyperlink w:history="1" r:id="rIdbedfsxlsmlgdpaucw-0gf">
+      <w:hyperlink w:history="1" r:id="rIdk0tvgq8yzpmguwbbhqool">
         <w:r>
           <w:rPr>
             <w:color w:val="1F5FA8"/>
@@ -13685,7 +13815,7 @@
         <w:tabs>
           <w:tab w:val="left" w:pos="500"/>
         </w:tabs>
-        <w:spacing w:after="90" w:line="264"/>
+        <w:spacing w:after="60" w:line="250"/>
         <w:ind w:left="500" w:hanging="500"/>
       </w:pPr>
       <w:r>
@@ -13705,7 +13835,7 @@
         </w:rPr>
         <w:t xml:space="preserve">Ikogosi Warm Springs Resort: History of the Resort, 1952. </w:t>
       </w:r>
-      <w:hyperlink w:history="1" r:id="rIdzorphvjczcbept9s4pd7r">
+      <w:hyperlink w:history="1" r:id="rIdgpawhdpsn1soiysqqyx6y">
         <w:r>
           <w:rPr>
             <w:color w:val="1F5FA8"/>
@@ -13722,7 +13852,7 @@
         <w:tabs>
           <w:tab w:val="left" w:pos="500"/>
         </w:tabs>
-        <w:spacing w:after="90" w:line="264"/>
+        <w:spacing w:after="60" w:line="250"/>
         <w:ind w:left="500" w:hanging="500"/>
       </w:pPr>
       <w:r>
@@ -13742,7 +13872,7 @@
         </w:rPr>
         <w:t xml:space="preserve">AJLA Journal: Ikogosi Warm Springs Resort case study. </w:t>
       </w:r>
-      <w:hyperlink w:history="1" r:id="rIdtkjpodudgdbnww_yefdwj">
+      <w:hyperlink w:history="1" r:id="rIdyn_rhbays_hz4_afveu0y">
         <w:r>
           <w:rPr>
             <w:color w:val="1F5FA8"/>
@@ -13759,7 +13889,7 @@
         <w:tabs>
           <w:tab w:val="left" w:pos="500"/>
         </w:tabs>
-        <w:spacing w:after="90" w:line="264"/>
+        <w:spacing w:after="60" w:line="250"/>
         <w:ind w:left="500" w:hanging="500"/>
       </w:pPr>
       <w:r>
@@ -13779,7 +13909,7 @@
         </w:rPr>
         <w:t xml:space="preserve">Premium Times: Ikogosi Warm Springs Resort, a night to remember. </w:t>
       </w:r>
-      <w:hyperlink w:history="1" r:id="rIdiqicrbdqtdlh8nsalytgf">
+      <w:hyperlink w:history="1" r:id="rIdvi9gv7gqmbmjbd_0qck9y">
         <w:r>
           <w:rPr>
             <w:color w:val="1F5FA8"/>
@@ -13796,7 +13926,7 @@
         <w:tabs>
           <w:tab w:val="left" w:pos="500"/>
         </w:tabs>
-        <w:spacing w:after="90" w:line="264"/>
+        <w:spacing w:after="60" w:line="250"/>
         <w:ind w:left="500" w:hanging="500"/>
       </w:pPr>
       <w:r>
@@ -13816,7 +13946,7 @@
         </w:rPr>
         <w:t xml:space="preserve">TheCable: Ekiti airport begins commercial flight operations. </w:t>
       </w:r>
-      <w:hyperlink w:history="1" r:id="rIdh19z7lfuyhf8vzys2qa_x">
+      <w:hyperlink w:history="1" r:id="rIdidyqojotn2o16hdlgsqyq">
         <w:r>
           <w:rPr>
             <w:color w:val="1F5FA8"/>
@@ -13833,7 +13963,7 @@
         <w:tabs>
           <w:tab w:val="left" w:pos="500"/>
         </w:tabs>
-        <w:spacing w:after="90" w:line="264"/>
+        <w:spacing w:after="60" w:line="250"/>
         <w:ind w:left="500" w:hanging="500"/>
       </w:pPr>
       <w:r>
@@ -13853,7 +13983,7 @@
         </w:rPr>
         <w:t xml:space="preserve">ch-aviation: Ado Ekiti opens for first commercial flights. </w:t>
       </w:r>
-      <w:hyperlink w:history="1" r:id="rIdzjyct44r_lztkymydpilj">
+      <w:hyperlink w:history="1" r:id="rIdkggnp2zn9rkdpg9tvw65y">
         <w:r>
           <w:rPr>
             <w:color w:val="1F5FA8"/>
@@ -13870,7 +14000,7 @@
         <w:tabs>
           <w:tab w:val="left" w:pos="500"/>
         </w:tabs>
-        <w:spacing w:after="90" w:line="264"/>
+        <w:spacing w:after="60" w:line="250"/>
         <w:ind w:left="500" w:hanging="500"/>
       </w:pPr>
       <w:r>
@@ -13890,7 +14020,7 @@
         </w:rPr>
         <w:t xml:space="preserve">Daily Trust: First commercial flight lands at Ekiti airport. </w:t>
       </w:r>
-      <w:hyperlink w:history="1" r:id="rIdzg02xqtfb_wd0uda-hupj">
+      <w:hyperlink w:history="1" r:id="rIdpsx1nd7ebej7wfg7-grn_">
         <w:r>
           <w:rPr>
             <w:color w:val="1F5FA8"/>
@@ -13907,7 +14037,7 @@
         <w:tabs>
           <w:tab w:val="left" w:pos="500"/>
         </w:tabs>
-        <w:spacing w:after="90" w:line="264"/>
+        <w:spacing w:after="60" w:line="250"/>
         <w:ind w:left="500" w:hanging="500"/>
       </w:pPr>
       <w:r>
@@ -13927,7 +14057,7 @@
         </w:rPr>
         <w:t xml:space="preserve">SaharaReporters: Ekiti Government confirms airport under construction (Oct 2022). </w:t>
       </w:r>
-      <w:hyperlink w:history="1" r:id="rIdgiyjtschnbh9jd7pdebfy">
+      <w:hyperlink w:history="1" r:id="rIdiuep3dymaz8wuqcip2adn">
         <w:r>
           <w:rPr>
             <w:color w:val="1F5FA8"/>
@@ -13944,7 +14074,7 @@
         <w:tabs>
           <w:tab w:val="left" w:pos="500"/>
         </w:tabs>
-        <w:spacing w:after="90" w:line="264"/>
+        <w:spacing w:after="60" w:line="250"/>
         <w:ind w:left="500" w:hanging="500"/>
       </w:pPr>
       <w:r>
@@ -13964,7 +14094,7 @@
         </w:rPr>
         <w:t xml:space="preserve">TechCabal: Ekiti's $80m Knowledge Zone (Aug 2025). </w:t>
       </w:r>
-      <w:hyperlink w:history="1" r:id="rId9kbsiv5buodu8knfufmgd">
+      <w:hyperlink w:history="1" r:id="rIdedjom_62trsjfwcsocgtu">
         <w:r>
           <w:rPr>
             <w:color w:val="1F5FA8"/>
@@ -13981,7 +14111,7 @@
         <w:tabs>
           <w:tab w:val="left" w:pos="500"/>
         </w:tabs>
-        <w:spacing w:after="90" w:line="264"/>
+        <w:spacing w:after="60" w:line="250"/>
         <w:ind w:left="500" w:hanging="500"/>
       </w:pPr>
       <w:r>
@@ -14001,7 +14131,7 @@
         </w:rPr>
         <w:t xml:space="preserve">Ekiti State University: About EKSU. </w:t>
       </w:r>
-      <w:hyperlink w:history="1" r:id="rIdyce6t_veftp7lp0247nzs">
+      <w:hyperlink w:history="1" r:id="rIdo7ndhk5mmxbqcwixll30q">
         <w:r>
           <w:rPr>
             <w:color w:val="1F5FA8"/>
@@ -14018,7 +14148,7 @@
         <w:tabs>
           <w:tab w:val="left" w:pos="500"/>
         </w:tabs>
-        <w:spacing w:after="90" w:line="264"/>
+        <w:spacing w:after="60" w:line="250"/>
         <w:ind w:left="500" w:hanging="500"/>
       </w:pPr>
       <w:r>
@@ -14038,7 +14168,7 @@
         </w:rPr>
         <w:t xml:space="preserve">Wikipedia: Ekiti State University. </w:t>
       </w:r>
-      <w:hyperlink w:history="1" r:id="rIdfignxy2ciikyvniv59pps">
+      <w:hyperlink w:history="1" r:id="rIdvwzfnx-jqjxi1xyjt1osz">
         <w:r>
           <w:rPr>
             <w:color w:val="1F5FA8"/>
@@ -14055,7 +14185,7 @@
         <w:tabs>
           <w:tab w:val="left" w:pos="500"/>
         </w:tabs>
-        <w:spacing w:after="90" w:line="264"/>
+        <w:spacing w:after="60" w:line="250"/>
         <w:ind w:left="500" w:hanging="500"/>
       </w:pPr>
       <w:r>
@@ -14075,7 +14205,7 @@
         </w:rPr>
         <w:t xml:space="preserve">Wikipedia: Federal University Oye Ekiti. </w:t>
       </w:r>
-      <w:hyperlink w:history="1" r:id="rIdqz37i6is80mbg-zugue45">
+      <w:hyperlink w:history="1" r:id="rIdpwgjkcnibvhv6q5totovr">
         <w:r>
           <w:rPr>
             <w:color w:val="1F5FA8"/>
@@ -14092,7 +14222,7 @@
         <w:tabs>
           <w:tab w:val="left" w:pos="500"/>
         </w:tabs>
-        <w:spacing w:after="90" w:line="264"/>
+        <w:spacing w:after="60" w:line="250"/>
         <w:ind w:left="500" w:hanging="500"/>
       </w:pPr>
       <w:r>
@@ -14112,7 +14242,7 @@
         </w:rPr>
         <w:t xml:space="preserve">Wikipedia: College of Education, Ikere Ekiti. </w:t>
       </w:r>
-      <w:hyperlink w:history="1" r:id="rIduchn3pbeygdwkvmjlht32">
+      <w:hyperlink w:history="1" r:id="rIde-ew5wseswiqip3dcirf9">
         <w:r>
           <w:rPr>
             <w:color w:val="1F5FA8"/>
@@ -14129,7 +14259,7 @@
         <w:tabs>
           <w:tab w:val="left" w:pos="500"/>
         </w:tabs>
-        <w:spacing w:after="90" w:line="264"/>
+        <w:spacing w:after="60" w:line="250"/>
         <w:ind w:left="500" w:hanging="500"/>
       </w:pPr>
       <w:r>
@@ -14149,7 +14279,7 @@
         </w:rPr>
         <w:t xml:space="preserve">Nigerian NewsDirect: Bamidele Olumilua Varsity gets VC, Registrar (Jan 2021). </w:t>
       </w:r>
-      <w:hyperlink w:history="1" r:id="rIdffa3pd_pukukwhigbq3x5">
+      <w:hyperlink w:history="1" r:id="rIdfcpnmws25viyeum1vw9b0">
         <w:r>
           <w:rPr>
             <w:color w:val="1F5FA8"/>
@@ -14166,7 +14296,7 @@
         <w:tabs>
           <w:tab w:val="left" w:pos="500"/>
         </w:tabs>
-        <w:spacing w:after="90" w:line="264"/>
+        <w:spacing w:after="60" w:line="250"/>
         <w:ind w:left="500" w:hanging="500"/>
       </w:pPr>
       <w:r>
@@ -14186,7 +14316,7 @@
         </w:rPr>
         <w:t xml:space="preserve">ListOfUni: BOUESTI (cites the university website on the 16 Oct 2020 upgrade). </w:t>
       </w:r>
-      <w:hyperlink w:history="1" r:id="rIdmkautkl009e6ta3oveni7">
+      <w:hyperlink w:history="1" r:id="rIdfdavhaghhbhvxdqlf05w0">
         <w:r>
           <w:rPr>
             <w:color w:val="1F5FA8"/>
@@ -14203,7 +14333,7 @@
         <w:tabs>
           <w:tab w:val="left" w:pos="500"/>
         </w:tabs>
-        <w:spacing w:after="90" w:line="264"/>
+        <w:spacing w:after="60" w:line="250"/>
         <w:ind w:left="500" w:hanging="500"/>
       </w:pPr>
       <w:r>
@@ -14223,7 +14353,7 @@
         </w:rPr>
         <w:t xml:space="preserve">Wikipedia: Federal Medical Centre, Ido Ekiti. </w:t>
       </w:r>
-      <w:hyperlink w:history="1" r:id="rIdk_o8vjavwmz-dixvi2ymw">
+      <w:hyperlink w:history="1" r:id="rIddtq9ghhc8ugnma2bijruz">
         <w:r>
           <w:rPr>
             <w:color w:val="1F5FA8"/>
@@ -14240,7 +14370,7 @@
         <w:tabs>
           <w:tab w:val="left" w:pos="500"/>
         </w:tabs>
-        <w:spacing w:after="90" w:line="264"/>
+        <w:spacing w:after="60" w:line="250"/>
         <w:ind w:left="500" w:hanging="500"/>
       </w:pPr>
       <w:r>
@@ -14260,7 +14390,7 @@
         </w:rPr>
         <w:t xml:space="preserve">Wikipedia: Afe Babalola University Teaching Hospital. </w:t>
       </w:r>
-      <w:hyperlink w:history="1" r:id="rIdcerxmgawqfy_krcw29_2i">
+      <w:hyperlink w:history="1" r:id="rIdwkmx6jsube2xnecshvzka">
         <w:r>
           <w:rPr>
             <w:color w:val="1F5FA8"/>
@@ -14277,7 +14407,7 @@
         <w:tabs>
           <w:tab w:val="left" w:pos="500"/>
         </w:tabs>
-        <w:spacing w:after="90" w:line="264"/>
+        <w:spacing w:after="60" w:line="250"/>
         <w:ind w:left="500" w:hanging="500"/>
       </w:pPr>
       <w:r>
@@ -14297,7 +14427,7 @@
         </w:rPr>
         <w:t xml:space="preserve">Ekiti State Government: Udiroko Festival, a catalyst for development. </w:t>
       </w:r>
-      <w:hyperlink w:history="1" r:id="rId09bqkrxljyxrqf98qazam">
+      <w:hyperlink w:history="1" r:id="rIdwuwcciucua8x5idor_7vx">
         <w:r>
           <w:rPr>
             <w:color w:val="1F5FA8"/>
@@ -14314,7 +14444,7 @@
         <w:tabs>
           <w:tab w:val="left" w:pos="500"/>
         </w:tabs>
-        <w:spacing w:after="90" w:line="264"/>
+        <w:spacing w:after="60" w:line="250"/>
         <w:ind w:left="500" w:hanging="500"/>
       </w:pPr>
       <w:r>
@@ -14334,7 +14464,7 @@
         </w:rPr>
         <w:t xml:space="preserve">Channels TV: Ado-Ekiti celebrates Udiroko Festival (Aug 2026). </w:t>
       </w:r>
-      <w:hyperlink w:history="1" r:id="rId_rp0f8tfukqplgdgreie0">
+      <w:hyperlink w:history="1" r:id="rIdnxjiw9cilrjzh_cj19w15">
         <w:r>
           <w:rPr>
             <w:color w:val="1F5FA8"/>
@@ -14351,7 +14481,7 @@
         <w:tabs>
           <w:tab w:val="left" w:pos="500"/>
         </w:tabs>
-        <w:spacing w:after="90" w:line="264"/>
+        <w:spacing w:after="60" w:line="250"/>
         <w:ind w:left="500" w:hanging="500"/>
       </w:pPr>
       <w:r>
@@ -14371,7 +14501,7 @@
         </w:rPr>
         <w:t xml:space="preserve">Tribune Online: Udiroko festival 2024. </w:t>
       </w:r>
-      <w:hyperlink w:history="1" r:id="rId8gen7n6i7dfdy4hm8jbcf">
+      <w:hyperlink w:history="1" r:id="rIdj9px4pued291d95kjzakz">
         <w:r>
           <w:rPr>
             <w:color w:val="1F5FA8"/>
@@ -14388,7 +14518,7 @@
         <w:tabs>
           <w:tab w:val="left" w:pos="500"/>
         </w:tabs>
-        <w:spacing w:after="90" w:line="264"/>
+        <w:spacing w:after="60" w:line="250"/>
         <w:ind w:left="500" w:hanging="500"/>
       </w:pPr>
       <w:r>
@@ -14408,7 +14538,7 @@
         </w:rPr>
         <w:t xml:space="preserve">Nigeria Galleria: Festivals and carnivals in Ekiti State. </w:t>
       </w:r>
-      <w:hyperlink w:history="1" r:id="rIdr4nwyvqpnufbd5i4ie45e">
+      <w:hyperlink w:history="1" r:id="rId8rt7l4mhntm5vxous3nog">
         <w:r>
           <w:rPr>
             <w:color w:val="1F5FA8"/>
@@ -14425,7 +14555,7 @@
         <w:tabs>
           <w:tab w:val="left" w:pos="500"/>
         </w:tabs>
-        <w:spacing w:after="90" w:line="264"/>
+        <w:spacing w:after="60" w:line="250"/>
         <w:ind w:left="500" w:hanging="500"/>
       </w:pPr>
       <w:r>
@@ -14445,7 +14575,7 @@
         </w:rPr>
         <w:t xml:space="preserve">ZODML: Ekiti State (governor and administrator dates). </w:t>
       </w:r>
-      <w:hyperlink w:history="1" r:id="rIdurlyts0lvuu6kcvmst6si">
+      <w:hyperlink w:history="1" r:id="rIdwqtjagf8kefrmijsozgdf">
         <w:r>
           <w:rPr>
             <w:color w:val="1F5FA8"/>
@@ -14462,7 +14592,7 @@
         <w:tabs>
           <w:tab w:val="left" w:pos="500"/>
         </w:tabs>
-        <w:spacing w:after="90" w:line="264"/>
+        <w:spacing w:after="60" w:line="250"/>
         <w:ind w:left="500" w:hanging="500"/>
       </w:pPr>
       <w:r>
@@ -14482,7 +14612,7 @@
         </w:rPr>
         <w:t xml:space="preserve">Legit.ng: Ekiti Governorship Election 2026 live updates (observer concerns). </w:t>
       </w:r>
-      <w:hyperlink w:history="1" r:id="rIdrvjoyicoaew-8nrpbfaak">
+      <w:hyperlink w:history="1" r:id="rId1wu7-xr2hvawz6nolqrtu">
         <w:r>
           <w:rPr>
             <w:color w:val="1F5FA8"/>
@@ -14499,7 +14629,7 @@
         <w:tabs>
           <w:tab w:val="left" w:pos="500"/>
         </w:tabs>
-        <w:spacing w:after="90" w:line="264"/>
+        <w:spacing w:after="60" w:line="250"/>
         <w:ind w:left="500" w:hanging="500"/>
       </w:pPr>
       <w:r>
@@ -14519,7 +14649,7 @@
         </w:rPr>
         <w:t xml:space="preserve">facts.ng: Ikogosi Warm Springs Resort (concession claim, unverified). </w:t>
       </w:r>
-      <w:hyperlink w:history="1" r:id="rId_kmlyrpb4fbax7j4oanz6">
+      <w:hyperlink w:history="1" r:id="rIdfo9c1lsaiwfnj7n549mmf">
         <w:r>
           <w:rPr>
             <w:color w:val="1F5FA8"/>
@@ -14536,7 +14666,7 @@
         <w:tabs>
           <w:tab w:val="left" w:pos="500"/>
         </w:tabs>
-        <w:spacing w:after="90" w:line="264"/>
+        <w:spacing w:after="60" w:line="250"/>
         <w:ind w:left="500" w:hanging="500"/>
       </w:pPr>
       <w:r>
@@ -14556,7 +14686,7 @@
         </w:rPr>
         <w:t xml:space="preserve">Ekiti State Government: Ekiti Knowledge Zone 'll Be Nigeria's Innovation, Job Creation Hub (sod-turning, Jun 2026). </w:t>
       </w:r>
-      <w:hyperlink w:history="1" r:id="rIdo2td3xad8mxnvfr6oa4xh">
+      <w:hyperlink w:history="1" r:id="rIdgmjt7igesn0qtk_setktf">
         <w:r>
           <w:rPr>
             <w:color w:val="1F5FA8"/>
@@ -14573,7 +14703,7 @@
         <w:tabs>
           <w:tab w:val="left" w:pos="500"/>
         </w:tabs>
-        <w:spacing w:after="90" w:line="264"/>
+        <w:spacing w:after="60" w:line="250"/>
         <w:ind w:left="500" w:hanging="500"/>
       </w:pPr>
       <w:r>
@@ -14593,7 +14723,7 @@
         </w:rPr>
         <w:t xml:space="preserve">African Development Bank: $80 million commitment to Ekiti Knowledge Zone (Feb 2024). </w:t>
       </w:r>
-      <w:hyperlink w:history="1" r:id="rIdz5sams0cg9t-hx0ywzte-">
+      <w:hyperlink w:history="1" r:id="rIdt30xthgz5wxjsc3pwfxlm">
         <w:r>
           <w:rPr>
             <w:color w:val="1F5FA8"/>
@@ -14610,7 +14740,7 @@
         <w:tabs>
           <w:tab w:val="left" w:pos="500"/>
         </w:tabs>
-        <w:spacing w:after="90" w:line="264"/>
+        <w:spacing w:after="60" w:line="250"/>
         <w:ind w:left="500" w:hanging="500"/>
       </w:pPr>
       <w:r>
@@ -14630,7 +14760,7 @@
         </w:rPr>
         <w:t xml:space="preserve">THISDAY: Glocient Hospitality Urges Tourists to Visit Ikogosi (Jul 2023). </w:t>
       </w:r>
-      <w:hyperlink w:history="1" r:id="rIdludxpz_mq8_rleawxq4so">
+      <w:hyperlink w:history="1" r:id="rIdazcjpqps7_sif4afb84s3">
         <w:r>
           <w:rPr>
             <w:color w:val="1F5FA8"/>
@@ -14647,7 +14777,7 @@
         <w:tabs>
           <w:tab w:val="left" w:pos="500"/>
         </w:tabs>
-        <w:spacing w:after="90" w:line="264"/>
+        <w:spacing w:after="60" w:line="250"/>
         <w:ind w:left="500" w:hanging="500"/>
       </w:pPr>
       <w:r>
@@ -14667,7 +14797,7 @@
         </w:rPr>
         <w:t xml:space="preserve">Ekiti State Government: Ikogosi Warm Spring Resort feature (opened Oct 2012). </w:t>
       </w:r>
-      <w:hyperlink w:history="1" r:id="rIddvacjfnu2zljrpstmacw9">
+      <w:hyperlink w:history="1" r:id="rId9u4nx_mb-xsp788ebbhxu">
         <w:r>
           <w:rPr>
             <w:color w:val="1F5FA8"/>
@@ -14684,7 +14814,7 @@
         <w:tabs>
           <w:tab w:val="left" w:pos="500"/>
         </w:tabs>
-        <w:spacing w:after="90" w:line="264"/>
+        <w:spacing w:after="60" w:line="250"/>
         <w:ind w:left="500" w:hanging="500"/>
       </w:pPr>
       <w:r>
@@ -14704,7 +14834,7 @@
         </w:rPr>
         <w:t xml:space="preserve">The Guardian Nigeria: Ekiti East By-election and specter of vicious bloodletting, violence (2021). </w:t>
       </w:r>
-      <w:hyperlink w:history="1" r:id="rIdycp1yc_r6vmolie8z8uko">
+      <w:hyperlink w:history="1" r:id="rId6vzvlewsiogi1rrnkbhxd">
         <w:r>
           <w:rPr>
             <w:color w:val="1F5FA8"/>
@@ -14721,7 +14851,7 @@
         <w:tabs>
           <w:tab w:val="left" w:pos="500"/>
         </w:tabs>
-        <w:spacing w:after="90" w:line="264"/>
+        <w:spacing w:after="60" w:line="250"/>
         <w:ind w:left="500" w:hanging="500"/>
       </w:pPr>
       <w:r>
@@ -14741,7 +14871,7 @@
         </w:rPr>
         <w:t xml:space="preserve">Vanguard: Ekiti: How Fayemi became governor (16 Oct 2010). </w:t>
       </w:r>
-      <w:hyperlink w:history="1" r:id="rId167rybybm2ljrlefxftoe">
+      <w:hyperlink w:history="1" r:id="rIdcd4izwg2rxyksr-rhbfbm">
         <w:r>
           <w:rPr>
             <w:color w:val="1F5FA8"/>
@@ -14758,7 +14888,7 @@
         <w:tabs>
           <w:tab w:val="left" w:pos="500"/>
         </w:tabs>
-        <w:spacing w:after="90" w:line="264"/>
+        <w:spacing w:after="60" w:line="250"/>
         <w:ind w:left="500" w:hanging="500"/>
       </w:pPr>
       <w:r>
@@ -14778,7 +14908,7 @@
         </w:rPr>
         <w:t xml:space="preserve">Afe Babalola University: Jonathan upgrades FMC, Ido-Ekiti to Teaching Hospital Status. </w:t>
       </w:r>
-      <w:hyperlink w:history="1" r:id="rId5mjumqlgspzp-69bsodqy">
+      <w:hyperlink w:history="1" r:id="rIdjxrh24scsgftlktzx1rmj">
         <w:r>
           <w:rPr>
             <w:color w:val="1F5FA8"/>
@@ -14795,7 +14925,7 @@
         <w:tabs>
           <w:tab w:val="left" w:pos="500"/>
         </w:tabs>
-        <w:spacing w:after="90" w:line="264"/>
+        <w:spacing w:after="60" w:line="250"/>
         <w:ind w:left="500" w:hanging="500"/>
       </w:pPr>
       <w:r>
@@ -14815,7 +14945,7 @@
         </w:rPr>
         <w:t xml:space="preserve">Afe Babalola University: Osinbajo inaugurates ABUAD Teaching Hospital (culled from Punch). </w:t>
       </w:r>
-      <w:hyperlink w:history="1" r:id="rIdxgh0bdo__iuiaa2ytlugx">
+      <w:hyperlink w:history="1" r:id="rIdiezurkar2uxoaccyyvqaf">
         <w:r>
           <w:rPr>
             <w:color w:val="1F5FA8"/>
@@ -14832,7 +14962,7 @@
         <w:tabs>
           <w:tab w:val="left" w:pos="500"/>
         </w:tabs>
-        <w:spacing w:after="90" w:line="264"/>
+        <w:spacing w:after="60" w:line="250"/>
         <w:ind w:left="500" w:hanging="500"/>
       </w:pPr>
       <w:r>
@@ -14852,7 +14982,7 @@
         </w:rPr>
         <w:t xml:space="preserve">Afe Babalola University: Background History of the Federal Medical Centre, Ido-Ekiti. </w:t>
       </w:r>
-      <w:hyperlink w:history="1" r:id="rIdx_ga37xsxopgcmcsrjcfa">
+      <w:hyperlink w:history="1" r:id="rIdtln3qlgyfz1utjhgibgvm">
         <w:r>
           <w:rPr>
             <w:color w:val="1F5FA8"/>
@@ -14869,7 +14999,7 @@
         <w:tabs>
           <w:tab w:val="left" w:pos="500"/>
         </w:tabs>
-        <w:spacing w:after="90" w:line="264"/>
+        <w:spacing w:after="60" w:line="250"/>
         <w:ind w:left="500" w:hanging="500"/>
       </w:pPr>
       <w:r>
@@ -14889,7 +15019,7 @@
         </w:rPr>
         <w:t xml:space="preserve">Voice of Nigeria: Vice Chancellor commends President Buhari's efforts to improve healthcare delivery. </w:t>
       </w:r>
-      <w:hyperlink w:history="1" r:id="rIdj1ixcaom9ph44-aecrpv7">
+      <w:hyperlink w:history="1" r:id="rId7zlxxxcdm_0-foq6aw_co">
         <w:r>
           <w:rPr>
             <w:color w:val="1F5FA8"/>
@@ -14906,7 +15036,7 @@
         <w:tabs>
           <w:tab w:val="left" w:pos="500"/>
         </w:tabs>
-        <w:spacing w:after="90" w:line="264"/>
+        <w:spacing w:after="60" w:line="250"/>
         <w:ind w:left="500" w:hanging="500"/>
       </w:pPr>
       <w:r>
@@ -14926,7 +15056,7 @@
         </w:rPr>
         <w:t xml:space="preserve">INEC: Declaration of Results, Ekiti State Governorship Election, June 21, 2014. </w:t>
       </w:r>
-      <w:hyperlink w:history="1" r:id="rIdmj-n_cn0ipymkwcbltuon">
+      <w:hyperlink w:history="1" r:id="rIdtymd7zgiuqwuzwsppupz5">
         <w:r>
           <w:rPr>
             <w:color w:val="1F5FA8"/>
@@ -14943,7 +15073,7 @@
         <w:tabs>
           <w:tab w:val="left" w:pos="500"/>
         </w:tabs>
-        <w:spacing w:after="90" w:line="264"/>
+        <w:spacing w:after="60" w:line="250"/>
         <w:ind w:left="500" w:hanging="500"/>
       </w:pPr>
       <w:r>
@@ -14963,7 +15093,7 @@
         </w:rPr>
         <w:t xml:space="preserve">Channels TV: INEC Announces Ekiti Governorship Election Results (15 Jul 2018). </w:t>
       </w:r>
-      <w:hyperlink w:history="1" r:id="rIdvhkoplqbdv7li5ps45mwz">
+      <w:hyperlink w:history="1" r:id="rIdkiuolidybrctlhboaaw3b">
         <w:r>
           <w:rPr>
             <w:color w:val="1F5FA8"/>
@@ -14980,7 +15110,7 @@
         <w:tabs>
           <w:tab w:val="left" w:pos="500"/>
         </w:tabs>
-        <w:spacing w:after="90" w:line="264"/>
+        <w:spacing w:after="60" w:line="250"/>
         <w:ind w:left="500" w:hanging="500"/>
       </w:pPr>
       <w:r>
@@ -15000,7 +15130,7 @@
         </w:rPr>
         <w:t xml:space="preserve">Vanguard: Fayemi appoints Olanipekun as chancellor of new Ekiti varsity (Feb 2021). </w:t>
       </w:r>
-      <w:hyperlink w:history="1" r:id="rIdzyw_41muljvpqdlbfxruu">
+      <w:hyperlink w:history="1" r:id="rId7whs7qxuvitozlgsmun3x">
         <w:r>
           <w:rPr>
             <w:color w:val="1F5FA8"/>
@@ -15017,7 +15147,7 @@
         <w:tabs>
           <w:tab w:val="left" w:pos="500"/>
         </w:tabs>
-        <w:spacing w:after="90" w:line="264"/>
+        <w:spacing w:after="60" w:line="250"/>
         <w:ind w:left="500" w:hanging="500"/>
       </w:pPr>
       <w:r>
@@ -15037,7 +15167,7 @@
         </w:rPr>
         <w:t xml:space="preserve">THISDAY: Agbeyewa Farm Set to Enhance Food Security, Create Jobs in Ekiti (23 Feb 2024). </w:t>
       </w:r>
-      <w:hyperlink w:history="1" r:id="rIdbi1llphuvclbk2esymaej">
+      <w:hyperlink w:history="1" r:id="rIdddio2oexdiekajxzct5co">
         <w:r>
           <w:rPr>
             <w:color w:val="1F5FA8"/>
@@ -15054,7 +15184,7 @@
         <w:tabs>
           <w:tab w:val="left" w:pos="500"/>
         </w:tabs>
-        <w:spacing w:after="90" w:line="264"/>
+        <w:spacing w:after="60" w:line="250"/>
         <w:ind w:left="500" w:hanging="500"/>
       </w:pPr>
       <w:r>
@@ -15074,7 +15204,7 @@
         </w:rPr>
         <w:t xml:space="preserve">Ekiti State Government: Ekiti Receives Ogun 2025 National Sports Festival Torch Of Unity. </w:t>
       </w:r>
-      <w:hyperlink w:history="1" r:id="rId4ylatwqke98mbiqhzy81r">
+      <w:hyperlink w:history="1" r:id="rIdnpu_ahhhid9oeo4hv-ijg">
         <w:r>
           <w:rPr>
             <w:color w:val="1F5FA8"/>
@@ -15091,7 +15221,7 @@
         <w:tabs>
           <w:tab w:val="left" w:pos="500"/>
         </w:tabs>
-        <w:spacing w:after="90" w:line="264"/>
+        <w:spacing w:after="60" w:line="250"/>
         <w:ind w:left="500" w:hanging="500"/>
       </w:pPr>
       <w:r>
@@ -15111,7 +15241,7 @@
         </w:rPr>
         <w:t xml:space="preserve">Ekiti State Government: Gov. Oyebanji Congratulates Ewi Of Ado Ekiti On 80th Birthday, 35th Coronation Anniversary. </w:t>
       </w:r>
-      <w:hyperlink w:history="1" r:id="rIdv0xgvpwd1khdvsokypfsu">
+      <w:hyperlink w:history="1" r:id="rIdrcfwnvycazcmcz9bhsgn3">
         <w:r>
           <w:rPr>
             <w:color w:val="1F5FA8"/>
@@ -15128,7 +15258,7 @@
         <w:tabs>
           <w:tab w:val="left" w:pos="500"/>
         </w:tabs>
-        <w:spacing w:after="90" w:line="264"/>
+        <w:spacing w:after="60" w:line="250"/>
         <w:ind w:left="500" w:hanging="500"/>
       </w:pPr>
       <w:r>
@@ -15148,7 +15278,7 @@
         </w:rPr>
         <w:t xml:space="preserve">Pulse Nigeria: INEC declares incumbent Oyebanji winner (21 Jun 2026). </w:t>
       </w:r>
-      <w:hyperlink w:history="1" r:id="rIdpgaa9edymawjlclqwilwa">
+      <w:hyperlink w:history="1" r:id="rIdxl2kndelbmsqwh-9j-mo4">
         <w:r>
           <w:rPr>
             <w:color w:val="1F5FA8"/>
@@ -15165,7 +15295,7 @@
         <w:tabs>
           <w:tab w:val="left" w:pos="500"/>
         </w:tabs>
-        <w:spacing w:after="90" w:line="264"/>
+        <w:spacing w:after="60" w:line="250"/>
         <w:ind w:left="500" w:hanging="500"/>
       </w:pPr>
       <w:r>
@@ -15185,7 +15315,7 @@
         </w:rPr>
         <w:t xml:space="preserve">Ekiti State Government: Governor Oyebanji: My Vision is for Ekiti to be a Land of Prosperity (16 Oct 2022). </w:t>
       </w:r>
-      <w:hyperlink w:history="1" r:id="rIds-j7uhquugt6axtokcvvx">
+      <w:hyperlink w:history="1" r:id="rIdo06ltzflfj6x4kgaviat1">
         <w:r>
           <w:rPr>
             <w:color w:val="1F5FA8"/>
@@ -15202,7 +15332,7 @@
         <w:tabs>
           <w:tab w:val="left" w:pos="500"/>
         </w:tabs>
-        <w:spacing w:after="90" w:line="264"/>
+        <w:spacing w:after="60" w:line="250"/>
         <w:ind w:left="500" w:hanging="500"/>
       </w:pPr>
       <w:r>
@@ -15222,7 +15352,7 @@
         </w:rPr>
         <w:t xml:space="preserve">The Guardian Nigeria: Oni and penchant for seeking judicial validation of elections (17 Jul 2022). </w:t>
       </w:r>
-      <w:hyperlink w:history="1" r:id="rIdq7x-e0adlsyil6aycaph_">
+      <w:hyperlink w:history="1" r:id="rIdyqkw3lxnpf517chox-okh">
         <w:r>
           <w:rPr>
             <w:color w:val="1F5FA8"/>
@@ -15239,7 +15369,7 @@
         <w:tabs>
           <w:tab w:val="left" w:pos="500"/>
         </w:tabs>
-        <w:spacing w:after="90" w:line="264"/>
+        <w:spacing w:after="60" w:line="250"/>
         <w:ind w:left="500" w:hanging="500"/>
       </w:pPr>
       <w:r>
@@ -15259,7 +15389,7 @@
         </w:rPr>
         <w:t xml:space="preserve">Federal University Oye-Ekiti: official website. </w:t>
       </w:r>
-      <w:hyperlink w:history="1" r:id="rIdwbdt1aemkoxddz7xoo5oy">
+      <w:hyperlink w:history="1" r:id="rIdowvl8o2jmrmlremnbdtvw">
         <w:r>
           <w:rPr>
             <w:color w:val="1F5FA8"/>
@@ -15276,7 +15406,7 @@
         <w:tabs>
           <w:tab w:val="left" w:pos="500"/>
         </w:tabs>
-        <w:spacing w:after="90" w:line="264"/>
+        <w:spacing w:after="60" w:line="250"/>
         <w:ind w:left="500" w:hanging="500"/>
       </w:pPr>
       <w:r>
@@ -15296,7 +15426,7 @@
         </w:rPr>
         <w:t xml:space="preserve">Ekiti State Government: About Ekiti. </w:t>
       </w:r>
-      <w:hyperlink w:history="1" r:id="rIdafvt9_k85xtgq3yspaehf">
+      <w:hyperlink w:history="1" r:id="rIdw2xsvotlhdwiqaejh-d9w">
         <w:r>
           <w:rPr>
             <w:color w:val="1F5FA8"/>
@@ -15313,7 +15443,7 @@
         <w:tabs>
           <w:tab w:val="left" w:pos="500"/>
         </w:tabs>
-        <w:spacing w:after="90" w:line="264"/>
+        <w:spacing w:after="60" w:line="250"/>
         <w:ind w:left="500" w:hanging="500"/>
       </w:pPr>
       <w:r>
@@ -15333,7 +15463,7 @@
         </w:rPr>
         <w:t xml:space="preserve">Ekiti State Government: Ekiti Marks 2nd Anniversary Of Social Security For Elderly Citizens. </w:t>
       </w:r>
-      <w:hyperlink w:history="1" r:id="rIdm_dpbzyingko4o6jezyuk">
+      <w:hyperlink w:history="1" r:id="rIdaif-k20qmt_cpglee7zn8">
         <w:r>
           <w:rPr>
             <w:color w:val="1F5FA8"/>
@@ -15350,7 +15480,7 @@
         <w:tabs>
           <w:tab w:val="left" w:pos="500"/>
         </w:tabs>
-        <w:spacing w:after="90" w:line="264"/>
+        <w:spacing w:after="60" w:line="250"/>
         <w:ind w:left="500" w:hanging="500"/>
       </w:pPr>
       <w:r>
@@ -15370,7 +15500,7 @@
         </w:rPr>
         <w:t xml:space="preserve">Ekiti State Government: Gov. Oyebanji Flags Off Multipurpose 80 Bed Hospital Facility At EKSUTH. </w:t>
       </w:r>
-      <w:hyperlink w:history="1" r:id="rIdzndbad3ffpyjrbostoqzf">
+      <w:hyperlink w:history="1" r:id="rIdegvi0nmydaj1tkhksc4um">
         <w:r>
           <w:rPr>
             <w:color w:val="1F5FA8"/>
@@ -15387,7 +15517,7 @@
         <w:tabs>
           <w:tab w:val="left" w:pos="500"/>
         </w:tabs>
-        <w:spacing w:after="90" w:line="264"/>
+        <w:spacing w:after="60" w:line="250"/>
         <w:ind w:left="500" w:hanging="500"/>
       </w:pPr>
       <w:r>
@@ -15407,7 +15537,7 @@
         </w:rPr>
         <w:t xml:space="preserve">Prime Business Africa: Imo, Ekiti Record Lowest Number Of Out Of School Children (31 Aug 2022). </w:t>
       </w:r>
-      <w:hyperlink w:history="1" r:id="rIdjfwdrxpdgywc_40l8mstg">
+      <w:hyperlink w:history="1" r:id="rIdxjg4shxf7ksckslcfxwiv">
         <w:r>
           <w:rPr>
             <w:color w:val="1F5FA8"/>
@@ -15424,7 +15554,7 @@
         <w:tabs>
           <w:tab w:val="left" w:pos="500"/>
         </w:tabs>
-        <w:spacing w:after="90" w:line="264"/>
+        <w:spacing w:after="60" w:line="250"/>
         <w:ind w:left="500" w:hanging="500"/>
       </w:pPr>
       <w:r>
@@ -15444,7 +15574,7 @@
         </w:rPr>
         <w:t xml:space="preserve">Ekiti State Government: Fayemi's Care For The Aged In Ekiti (Fayemi sworn in 16 Oct 2010). </w:t>
       </w:r>
-      <w:hyperlink w:history="1" r:id="rIdsw3kqqa1lkjgbhelfjxnv">
+      <w:hyperlink w:history="1" r:id="rIdqzhcnxmqlrgpuvou4jnpd">
         <w:r>
           <w:rPr>
             <w:color w:val="1F5FA8"/>
@@ -15461,7 +15591,7 @@
         <w:tabs>
           <w:tab w:val="left" w:pos="500"/>
         </w:tabs>
-        <w:spacing w:after="90" w:line="264"/>
+        <w:spacing w:after="60" w:line="250"/>
         <w:ind w:left="500" w:hanging="500"/>
       </w:pPr>
       <w:r>
@@ -15481,7 +15611,7 @@
         </w:rPr>
         <w:t xml:space="preserve">Times Higher Education: Afe Babalola University profile. </w:t>
       </w:r>
-      <w:hyperlink w:history="1" r:id="rId1l9o5baxlnozkzczis_bd">
+      <w:hyperlink w:history="1" r:id="rIds1mi2hitmq8lqlmscrcjm">
         <w:r>
           <w:rPr>
             <w:color w:val="1F5FA8"/>
@@ -15498,7 +15628,7 @@
         <w:tabs>
           <w:tab w:val="left" w:pos="500"/>
         </w:tabs>
-        <w:spacing w:after="90" w:line="264"/>
+        <w:spacing w:after="60" w:line="250"/>
         <w:ind w:left="500" w:hanging="500"/>
       </w:pPr>
       <w:r>
@@ -15518,7 +15648,7 @@
         </w:rPr>
         <w:t xml:space="preserve">The Guardian Nigeria: Ekiti Assembly hails Agbeyewa Farms (Aug 2025). </w:t>
       </w:r>
-      <w:hyperlink w:history="1" r:id="rIdql74jg9c41lgfbc1ulzen">
+      <w:hyperlink w:history="1" r:id="rId5ztbhiuxbddvk6iz4revh">
         <w:r>
           <w:rPr>
             <w:color w:val="1F5FA8"/>
@@ -15527,6 +15657,339 @@
             <w:u w:val="single"/>
           </w:rPr>
           <w:t xml:space="preserve">https://guardian.ng/features/agro-care/ekiti-assembly-hails-agbeyewa-farms-says-agric-revolution-will-end-hunger-in-nigeria/</w:t>
+        </w:r>
+      </w:hyperlink>
+    </w:p>
+    <w:p>
+      <w:pPr>
+        <w:tabs>
+          <w:tab w:val="left" w:pos="500"/>
+        </w:tabs>
+        <w:spacing w:after="60" w:line="250"/>
+        <w:ind w:left="500" w:hanging="500"/>
+      </w:pPr>
+      <w:r>
+        <w:rPr>
+          <w:b/>
+          <w:bCs/>
+          <w:color w:val="6B7280"/>
+          <w:sz w:val="18"/>
+          <w:szCs w:val="18"/>
+        </w:rPr>
+        <w:t xml:space="preserve">[65]	</w:t>
+      </w:r>
+      <w:r>
+        <w:rPr>
+          <w:sz w:val="18"/>
+          <w:szCs w:val="18"/>
+        </w:rPr>
+        <w:t xml:space="preserve">BusinessDay: Supreme Court dismisses APC's appeal, affirms Ayo Fayose governor (14 Apr 2015). </w:t>
+      </w:r>
+      <w:hyperlink w:history="1" r:id="rIdtghhtv3bxuks9qfzewm_k">
+        <w:r>
+          <w:rPr>
+            <w:color w:val="1F5FA8"/>
+            <w:sz w:val="16"/>
+            <w:szCs w:val="16"/>
+            <w:u w:val="single"/>
+          </w:rPr>
+          <w:t xml:space="preserve">https://businessday.ng/uncategorized/article/supreme-court-dismisses-apcs-appeal-affirms-ayo-fayose-governor/</w:t>
+        </w:r>
+      </w:hyperlink>
+    </w:p>
+    <w:p>
+      <w:pPr>
+        <w:tabs>
+          <w:tab w:val="left" w:pos="500"/>
+        </w:tabs>
+        <w:spacing w:after="60" w:line="250"/>
+        <w:ind w:left="500" w:hanging="500"/>
+      </w:pPr>
+      <w:r>
+        <w:rPr>
+          <w:b/>
+          <w:bCs/>
+          <w:color w:val="6B7280"/>
+          <w:sz w:val="18"/>
+          <w:szCs w:val="18"/>
+        </w:rPr>
+        <w:t xml:space="preserve">[66]	</w:t>
+      </w:r>
+      <w:r>
+        <w:rPr>
+          <w:sz w:val="18"/>
+          <w:szCs w:val="18"/>
+        </w:rPr>
+        <w:t xml:space="preserve">Vanguard: Breaking news: Fayose's impeachment in 2006 not valid - Supreme Court (14 Apr 2015). </w:t>
+      </w:r>
+      <w:hyperlink w:history="1" r:id="rId-hgjrg1iu0k-mbtbmfthw">
+        <w:r>
+          <w:rPr>
+            <w:color w:val="1F5FA8"/>
+            <w:sz w:val="16"/>
+            <w:szCs w:val="16"/>
+            <w:u w:val="single"/>
+          </w:rPr>
+          <w:t xml:space="preserve">https://www.vanguardngr.com/2015/04/breaking-news-supreme-court-affirms-fayoses-victory/</w:t>
+        </w:r>
+      </w:hyperlink>
+    </w:p>
+    <w:p>
+      <w:pPr>
+        <w:tabs>
+          <w:tab w:val="left" w:pos="500"/>
+        </w:tabs>
+        <w:spacing w:after="60" w:line="250"/>
+        <w:ind w:left="500" w:hanging="500"/>
+      </w:pPr>
+      <w:r>
+        <w:rPr>
+          <w:b/>
+          <w:bCs/>
+          <w:color w:val="6B7280"/>
+          <w:sz w:val="18"/>
+          <w:szCs w:val="18"/>
+        </w:rPr>
+        <w:t xml:space="preserve">[67]	</w:t>
+      </w:r>
+      <w:r>
+        <w:rPr>
+          <w:sz w:val="18"/>
+          <w:szCs w:val="18"/>
+        </w:rPr>
+        <w:t xml:space="preserve">Daily Trust: INEC declares Oyebanji winner of Ekiti governorship election (21 Jun 2026). </w:t>
+      </w:r>
+      <w:hyperlink w:history="1" r:id="rIdduazkspi1fozk-yyi4u5v">
+        <w:r>
+          <w:rPr>
+            <w:color w:val="1F5FA8"/>
+            <w:sz w:val="16"/>
+            <w:szCs w:val="16"/>
+            <w:u w:val="single"/>
+          </w:rPr>
+          <w:t xml:space="preserve">https://dailytrust.com/inec-declares-oyebanji-winner-of-ekiti-governorship-election/</w:t>
+        </w:r>
+      </w:hyperlink>
+    </w:p>
+    <w:p>
+      <w:pPr>
+        <w:tabs>
+          <w:tab w:val="left" w:pos="500"/>
+        </w:tabs>
+        <w:spacing w:after="60" w:line="250"/>
+        <w:ind w:left="500" w:hanging="500"/>
+      </w:pPr>
+      <w:r>
+        <w:rPr>
+          <w:b/>
+          <w:bCs/>
+          <w:color w:val="6B7280"/>
+          <w:sz w:val="18"/>
+          <w:szCs w:val="18"/>
+        </w:rPr>
+        <w:t xml:space="preserve">[68]	</w:t>
+      </w:r>
+      <w:r>
+        <w:rPr>
+          <w:sz w:val="18"/>
+          <w:szCs w:val="18"/>
+        </w:rPr>
+        <w:t xml:space="preserve">Premium Times: #EkitiDecides2026: Oyebanji secures second term, defies Ekiti's history of unseating incumbents (21 Jun 2026). </w:t>
+      </w:r>
+      <w:hyperlink w:history="1" r:id="rIdrdzp3pjturh5au2suqgbb">
+        <w:r>
+          <w:rPr>
+            <w:color w:val="1F5FA8"/>
+            <w:sz w:val="16"/>
+            <w:szCs w:val="16"/>
+            <w:u w:val="single"/>
+          </w:rPr>
+          <w:t xml:space="preserve">https://www.premiumtimesng.com/regional/ssouth-west/889505-ekitidecides2026-oyebanji-secures-second-term-defies-ekitis-history-of-unseating-incumbents.html</w:t>
+        </w:r>
+      </w:hyperlink>
+    </w:p>
+    <w:p>
+      <w:pPr>
+        <w:tabs>
+          <w:tab w:val="left" w:pos="500"/>
+        </w:tabs>
+        <w:spacing w:after="60" w:line="250"/>
+        <w:ind w:left="500" w:hanging="500"/>
+      </w:pPr>
+      <w:r>
+        <w:rPr>
+          <w:b/>
+          <w:bCs/>
+          <w:color w:val="6B7280"/>
+          <w:sz w:val="18"/>
+          <w:szCs w:val="18"/>
+        </w:rPr>
+        <w:t xml:space="preserve">[69]	</w:t>
+      </w:r>
+      <w:r>
+        <w:rPr>
+          <w:sz w:val="18"/>
+          <w:szCs w:val="18"/>
+        </w:rPr>
+        <w:t xml:space="preserve">Dataphyte: Ekiti Governorship Election 2026: The Anti-incumbency Pattern and APC's Current Dominance (19 Jun 2026). </w:t>
+      </w:r>
+      <w:hyperlink w:history="1" r:id="rIdcjczznhduwynjiwqsuk25">
+        <w:r>
+          <w:rPr>
+            <w:color w:val="1F5FA8"/>
+            <w:sz w:val="16"/>
+            <w:szCs w:val="16"/>
+            <w:u w:val="single"/>
+          </w:rPr>
+          <w:t xml:space="preserve">https://www.dataphyte.com/topic/elections/ekiti-governorship-election-2026-the-anti-incumbency-pattern-and-apcs-current-dominance</w:t>
+        </w:r>
+      </w:hyperlink>
+    </w:p>
+    <w:p>
+      <w:pPr>
+        <w:tabs>
+          <w:tab w:val="left" w:pos="500"/>
+        </w:tabs>
+        <w:spacing w:after="60" w:line="250"/>
+        <w:ind w:left="500" w:hanging="500"/>
+      </w:pPr>
+      <w:r>
+        <w:rPr>
+          <w:b/>
+          <w:bCs/>
+          <w:color w:val="6B7280"/>
+          <w:sz w:val="18"/>
+          <w:szCs w:val="18"/>
+        </w:rPr>
+        <w:t xml:space="preserve">[70]	</w:t>
+      </w:r>
+      <w:r>
+        <w:rPr>
+          <w:sz w:val="18"/>
+          <w:szCs w:val="18"/>
+        </w:rPr>
+        <w:t xml:space="preserve">Premium Times: It's Official: INEC declares APC's Oyebanji winner (Form EC8E, 21 Jun 2026). </w:t>
+      </w:r>
+      <w:hyperlink w:history="1" r:id="rIdgmmy6atyc5umn_qdvlbmj">
+        <w:r>
+          <w:rPr>
+            <w:color w:val="1F5FA8"/>
+            <w:sz w:val="16"/>
+            <w:szCs w:val="16"/>
+            <w:u w:val="single"/>
+          </w:rPr>
+          <w:t xml:space="preserve">https://www.premiumtimesng.com/regional/ssouth-west/889497-its-official-inec-declares-apcs-oyebanji-winner-of-ekiti-governorship-election.html</w:t>
+        </w:r>
+      </w:hyperlink>
+    </w:p>
+    <w:p>
+      <w:pPr>
+        <w:tabs>
+          <w:tab w:val="left" w:pos="500"/>
+        </w:tabs>
+        <w:spacing w:after="60" w:line="250"/>
+        <w:ind w:left="500" w:hanging="500"/>
+      </w:pPr>
+      <w:r>
+        <w:rPr>
+          <w:b/>
+          <w:bCs/>
+          <w:color w:val="6B7280"/>
+          <w:sz w:val="18"/>
+          <w:szCs w:val="18"/>
+        </w:rPr>
+        <w:t xml:space="preserve">[71]	</w:t>
+      </w:r>
+      <w:r>
+        <w:rPr>
+          <w:sz w:val="18"/>
+          <w:szCs w:val="18"/>
+        </w:rPr>
+        <w:t xml:space="preserve">INEC (official Facebook page): Declaration of Result, Ekiti State Governorship Election, 18 June 2022. </w:t>
+      </w:r>
+      <w:hyperlink w:history="1" r:id="rIda-1a-uikmznmcziyy2pkm">
+        <w:r>
+          <w:rPr>
+            <w:color w:val="1F5FA8"/>
+            <w:sz w:val="16"/>
+            <w:szCs w:val="16"/>
+            <w:u w:val="single"/>
+          </w:rPr>
+          <w:t xml:space="preserve">https://www.facebook.com/inecnigeria/posts/declaration-of-result-of-the-ekiti-state-governorship-election-held-on-saturday-/404942308325501/</w:t>
+        </w:r>
+      </w:hyperlink>
+    </w:p>
+    <w:p>
+      <w:pPr>
+        <w:tabs>
+          <w:tab w:val="left" w:pos="500"/>
+        </w:tabs>
+        <w:spacing w:after="60" w:line="250"/>
+        <w:ind w:left="500" w:hanging="500"/>
+      </w:pPr>
+      <w:r>
+        <w:rPr>
+          <w:b/>
+          <w:bCs/>
+          <w:color w:val="6B7280"/>
+          <w:sz w:val="18"/>
+          <w:szCs w:val="18"/>
+        </w:rPr>
+        <w:t xml:space="preserve">[72]	</w:t>
+      </w:r>
+      <w:r>
+        <w:rPr>
+          <w:sz w:val="18"/>
+          <w:szCs w:val="18"/>
+        </w:rPr>
+        <w:t xml:space="preserve">Vanguard: INEC declares Oyebanji winner of Ekiti governorship election (21 Jun 2026). </w:t>
+      </w:r>
+      <w:hyperlink w:history="1" r:id="rIdvfcdzn_ithbhyqfnbsych">
+        <w:r>
+          <w:rPr>
+            <w:color w:val="1F5FA8"/>
+            <w:sz w:val="16"/>
+            <w:szCs w:val="16"/>
+            <w:u w:val="single"/>
+          </w:rPr>
+          <w:t xml:space="preserve">https://www.vanguardngr.com/2026/06/inec-declares-oyebanji-winner-of-ekiti-governorship-election/</w:t>
+        </w:r>
+      </w:hyperlink>
+    </w:p>
+    <w:p>
+      <w:pPr>
+        <w:tabs>
+          <w:tab w:val="left" w:pos="500"/>
+        </w:tabs>
+        <w:spacing w:after="60" w:line="250"/>
+        <w:ind w:left="500" w:hanging="500"/>
+      </w:pPr>
+      <w:r>
+        <w:rPr>
+          <w:b/>
+          <w:bCs/>
+          <w:color w:val="6B7280"/>
+          <w:sz w:val="18"/>
+          <w:szCs w:val="18"/>
+        </w:rPr>
+        <w:t xml:space="preserve">[73]	</w:t>
+      </w:r>
+      <w:r>
+        <w:rPr>
+          <w:sz w:val="18"/>
+          <w:szCs w:val="18"/>
+        </w:rPr>
+        <w:t xml:space="preserve">THISDAY: Live Updates: Ekiti Governorship Election 2026 (21 Jun 2026). </w:t>
+      </w:r>
+      <w:hyperlink w:history="1" r:id="rIdmbazkbanitkg_jmsrnjqc">
+        <w:r>
+          <w:rPr>
+            <w:color w:val="1F5FA8"/>
+            <w:sz w:val="16"/>
+            <w:szCs w:val="16"/>
+            <w:u w:val="single"/>
+          </w:rPr>
+          <w:t xml:space="preserve">https://www.thisdaylive.com/2026/06/21/live-updates-ekiti-governorship-election-2026/</w:t>
         </w:r>
       </w:hyperlink>
     </w:p>

</xml_diff>